<commit_message>
Add Sermon 15 and replace Buddha-Father variants
</commit_message>
<xml_diff>
--- a/docx/sermon_011_ENGLISH.docx
+++ b/docx/sermon_011_ENGLISH.docx
@@ -3,8 +3,13 @@
 <w:document xmlns:wpc="http://schemas.microsoft.com/office/word/2010/wordprocessingCanvas" xmlns:cx="http://schemas.microsoft.com/office/drawing/2014/chartex" xmlns:cx1="http://schemas.microsoft.com/office/drawing/2015/9/8/chartex" xmlns:cx2="http://schemas.microsoft.com/office/drawing/2015/10/21/chartex" xmlns:cx3="http://schemas.microsoft.com/office/drawing/2016/5/9/chartex" xmlns:cx4="http://schemas.microsoft.com/office/drawing/2016/5/10/chartex" xmlns:cx5="http://schemas.microsoft.com/office/drawing/2016/5/11/chartex" xmlns:cx6="http://schemas.microsoft.com/office/drawing/2016/5/12/chartex" xmlns:cx7="http://schemas.microsoft.com/office/drawing/2016/5/13/chartex" xmlns:cx8="http://schemas.microsoft.com/office/drawing/2016/5/14/chartex" xmlns:mc="http://schemas.openxmlformats.org/markup-compatibility/2006" xmlns:aink="http://schemas.microsoft.com/office/drawing/2016/ink" xmlns:am3d="http://schemas.microsoft.com/office/drawing/2017/model3d" xmlns:o="urn:schemas-microsoft-com:office:office" xmlns:oel="http://schemas.microsoft.com/office/2019/extlst" xmlns:r="http://schemas.openxmlformats.org/officeDocument/2006/relationships" xmlns:m="http://schemas.openxmlformats.org/officeDocument/2006/math" xmlns:v="urn:schemas-microsoft-com:vml" xmlns:wp14="http://schemas.microsoft.com/office/word/2010/wordprocessingDrawing" xmlns:wp="http://schemas.openxmlformats.org/drawingml/2006/wordprocessingDrawing" xmlns:w10="urn:schemas-microsoft-com:office:word" xmlns:w="http://schemas.openxmlformats.org/wordprocessingml/2006/main" xmlns:w14="http://schemas.microsoft.com/office/word/2010/wordml" xmlns:w15="http://schemas.microsoft.com/office/word/2012/wordml" xmlns:w16cex="http://schemas.microsoft.com/office/word/2018/wordml/cex" xmlns:w16cid="http://schemas.microsoft.com/office/word/2016/wordml/cid" xmlns:w16="http://schemas.microsoft.com/office/word/2018/wordml" xmlns:w16du="http://schemas.microsoft.com/office/word/2023/wordml/word16du" xmlns:w16sdtdh="http://schemas.microsoft.com/office/word/2020/wordml/sdtdatahash" xmlns:w16sdtfl="http://schemas.microsoft.com/office/word/2024/wordml/sdtformatlock" xmlns:w16se="http://schemas.microsoft.com/office/word/2015/wordml/symex" xmlns:wpg="http://schemas.microsoft.com/office/word/2010/wordprocessingGroup" xmlns:wpi="http://schemas.microsoft.com/office/word/2010/wordprocessingInk" xmlns:wne="http://schemas.microsoft.com/office/word/2006/wordml" xmlns:wps="http://schemas.microsoft.com/office/word/2010/wordprocessingShape" mc:Ignorable="w14 w15 w16se w16cid w16 w16cex w16sdtdh w16sdtfl w16du wp14">
   <w:body>
     <w:p>
-      <w:r>
-        <w:t>Pahankanuwa Sermon #11</w:t>
+      <w:proofErr w:type="spellStart"/>
+      <w:r>
+        <w:t>Pahankanuwa</w:t>
+      </w:r>
+      <w:proofErr w:type="spellEnd"/>
+      <w:r>
+        <w:t xml:space="preserve"> Sermon #11</w:t>
       </w:r>
     </w:p>
     <w:p>
@@ -17,551 +22,3304 @@
       </w:r>
       <w:r>
         <w:br/>
-        <w:t>Author: Ven. Katukurunde Nanananda Thero</w:t>
+        <w:t xml:space="preserve">Author: Ven. </w:t>
+      </w:r>
+      <w:proofErr w:type="spellStart"/>
+      <w:r>
+        <w:t>Katukurunde</w:t>
+      </w:r>
+      <w:proofErr w:type="spellEnd"/>
+      <w:r>
+        <w:t xml:space="preserve"> </w:t>
+      </w:r>
+      <w:proofErr w:type="spellStart"/>
+      <w:r>
+        <w:t>Nanananda</w:t>
+      </w:r>
+      <w:proofErr w:type="spellEnd"/>
+      <w:r>
+        <w:t xml:space="preserve"> Thero</w:t>
       </w:r>
     </w:p>
     <w:p>
       <w:r>
-        <w:t>(Pahankaṇuwa Sinhala Audio Dhamma Sermon No. )</w:t>
-      </w:r>
+        <w:t>(</w:t>
+      </w:r>
+      <w:proofErr w:type="spellStart"/>
+      <w:r>
+        <w:t>Pahankaṇuwa</w:t>
+      </w:r>
+      <w:proofErr w:type="spellEnd"/>
+      <w:r>
+        <w:t xml:space="preserve"> Sinhala Audio Dhamma Sermon </w:t>
+      </w:r>
+      <w:proofErr w:type="gramStart"/>
+      <w:r>
+        <w:t>No. )</w:t>
+      </w:r>
+      <w:proofErr w:type="gramEnd"/>
     </w:p>
     <w:p>
       <w:r>
-        <w:t>Namo tassa bhagavato arahato sammāsambuddhassa</w:t>
-      </w:r>
+        <w:t xml:space="preserve">Namo </w:t>
+      </w:r>
+      <w:proofErr w:type="spellStart"/>
+      <w:r>
+        <w:t>tassa</w:t>
+      </w:r>
+      <w:proofErr w:type="spellEnd"/>
+      <w:r>
+        <w:t xml:space="preserve"> </w:t>
+      </w:r>
+      <w:proofErr w:type="spellStart"/>
+      <w:r>
+        <w:t>bhagavato</w:t>
+      </w:r>
+      <w:proofErr w:type="spellEnd"/>
+      <w:r>
+        <w:t xml:space="preserve"> </w:t>
+      </w:r>
+      <w:proofErr w:type="spellStart"/>
+      <w:r>
+        <w:t>arahato</w:t>
+      </w:r>
+      <w:proofErr w:type="spellEnd"/>
+      <w:r>
+        <w:t xml:space="preserve"> </w:t>
+      </w:r>
+      <w:proofErr w:type="spellStart"/>
+      <w:r>
+        <w:t>sammāsambuddhassa</w:t>
+      </w:r>
+      <w:proofErr w:type="spellEnd"/>
       <w:r>
         <w:br/>
       </w:r>
       <w:r>
         <w:br/>
         <w:t>(Homage to the Blessed One, the Worthy One, the Fully Self-Enlightened One)</w:t>
+      </w:r>
+    </w:p>
+    <w:p/>
+    <w:p/>
+    <w:p/>
+    <w:p>
+      <w:r>
+        <w:t>*</w:t>
+      </w:r>
+      <w:proofErr w:type="spellStart"/>
+      <w:r>
+        <w:t>Pathavyā</w:t>
+      </w:r>
+      <w:proofErr w:type="spellEnd"/>
+      <w:r>
+        <w:t xml:space="preserve"> </w:t>
+      </w:r>
+      <w:proofErr w:type="spellStart"/>
+      <w:r>
+        <w:t>ekarajjena</w:t>
+      </w:r>
+      <w:proofErr w:type="spellEnd"/>
+      <w:r>
+        <w:t>*</w:t>
+      </w:r>
+    </w:p>
+    <w:p>
+      <w:r>
+        <w:t>*</w:t>
+      </w:r>
+      <w:proofErr w:type="spellStart"/>
+      <w:r>
+        <w:t>Saggassa</w:t>
+      </w:r>
+      <w:proofErr w:type="spellEnd"/>
+      <w:r>
+        <w:t xml:space="preserve"> </w:t>
+      </w:r>
+      <w:proofErr w:type="spellStart"/>
+      <w:r>
+        <w:t>gamanena</w:t>
+      </w:r>
+      <w:proofErr w:type="spellEnd"/>
+      <w:r>
+        <w:t xml:space="preserve"> </w:t>
+      </w:r>
+      <w:proofErr w:type="spellStart"/>
+      <w:r>
+        <w:t>vā</w:t>
+      </w:r>
+      <w:proofErr w:type="spellEnd"/>
+      <w:r>
+        <w:t>*</w:t>
+      </w:r>
+    </w:p>
+    <w:p>
+      <w:r>
+        <w:t>*</w:t>
+      </w:r>
+      <w:proofErr w:type="spellStart"/>
+      <w:r>
+        <w:t>Sabbalokādhipaccena</w:t>
+      </w:r>
+      <w:proofErr w:type="spellEnd"/>
+      <w:r>
+        <w:t>*</w:t>
+      </w:r>
+    </w:p>
+    <w:p>
+      <w:r>
+        <w:t>*</w:t>
+      </w:r>
+      <w:proofErr w:type="spellStart"/>
+      <w:r>
+        <w:t>Sotāpattiphalaṁ</w:t>
+      </w:r>
+      <w:proofErr w:type="spellEnd"/>
+      <w:r>
+        <w:t xml:space="preserve"> </w:t>
+      </w:r>
+      <w:proofErr w:type="spellStart"/>
+      <w:r>
+        <w:t>varaṁ</w:t>
+      </w:r>
+      <w:proofErr w:type="spellEnd"/>
+      <w:r>
+        <w:t>*</w:t>
       </w:r>
     </w:p>
     <w:p/>
     <w:p>
-      <w:r/>
-    </w:p>
-    <w:p/>
-    <w:p>
-      <w:r>
-        <w:t>*Pathavyā ekarajjena*</w:t>
+      <w:r>
+        <w:t xml:space="preserve">— *Loka </w:t>
+      </w:r>
+      <w:proofErr w:type="spellStart"/>
+      <w:r>
+        <w:t>Vagga</w:t>
+      </w:r>
+      <w:proofErr w:type="spellEnd"/>
+      <w:r>
+        <w:t>, Dhammapada*</w:t>
       </w:r>
     </w:p>
     <w:p>
       <w:r>
-        <w:t>*Saggassa gamanena vā*</w:t>
+        <w:t>Dear Listeners,</w:t>
       </w:r>
     </w:p>
     <w:p>
       <w:r>
-        <w:t>*Sabbalokādhipaccena*</w:t>
+        <w:t xml:space="preserve">Today, on this Vap Full </w:t>
+      </w:r>
+      <w:proofErr w:type="gramStart"/>
+      <w:r>
+        <w:t>Moon Poya day</w:t>
+      </w:r>
+      <w:proofErr w:type="gramEnd"/>
+      <w:r>
+        <w:t xml:space="preserve">, despite the inclement weather, you have gathered here to listen to some </w:t>
+      </w:r>
+      <w:proofErr w:type="gramStart"/>
+      <w:r>
+        <w:t>word</w:t>
+      </w:r>
+      <w:proofErr w:type="gramEnd"/>
+      <w:r>
+        <w:t xml:space="preserve"> of the </w:t>
+      </w:r>
+      <w:proofErr w:type="gramStart"/>
+      <w:r>
+        <w:t>Dhamma—a</w:t>
+      </w:r>
+      <w:proofErr w:type="gramEnd"/>
+      <w:r>
+        <w:t xml:space="preserve"> section of the Dhamma—of the Blessed One. Buddhist devotees expect to listen to the Dhamma </w:t>
+      </w:r>
+      <w:proofErr w:type="gramStart"/>
+      <w:r>
+        <w:t>in order to</w:t>
+      </w:r>
+      <w:proofErr w:type="gramEnd"/>
+      <w:r>
+        <w:t xml:space="preserve"> obtain some light for their lives, to mold their lives. This human life we have obtained has been introduced by the Blessed One as something extremely rare. Human life is rare; likewise, it is a valuable life. But the value of this humanity is not received automatically. The worth or worthlessness of a life is determined, or decided, by the lifestyle we lead. Even if one lives for a hundred years, if that person spent their life with worthless things, with essence-less things, then that life is entirely fruitless and barren.</w:t>
       </w:r>
     </w:p>
     <w:p>
       <w:r>
-        <w:t>*Sotāpattiphalaṁ varaṁ*</w:t>
-      </w:r>
-    </w:p>
-    <w:p/>
-    <w:p>
-      <w:r>
-        <w:t>— *Loka Vagga, Dhammapada*</w:t>
+        <w:t xml:space="preserve">Therefore, it is the duty of a Buddhist devotee to live having understood the true values, the true virtues—the real value in a life. Generally, in the world, money, gold, silver, pearls, and gems are considered valuable. But the Blessed One introduced far nobler things to the world through the Dhamma. To understand those values introduced in accordance with the Dhamma and to live accordingly—to mold one’s life </w:t>
+      </w:r>
+      <w:proofErr w:type="gramStart"/>
+      <w:r>
+        <w:t>accordingly—a Poya</w:t>
+      </w:r>
+      <w:proofErr w:type="gramEnd"/>
+      <w:r>
+        <w:t xml:space="preserve"> day is a wonderful, valuable day. It is revealed in the Dhamma stories that even during the time of </w:t>
+      </w:r>
+      <w:r>
+        <w:lastRenderedPageBreak/>
+        <w:t xml:space="preserve">the Buddha, great lay devotees used this Poya day to make their children understand and realize the true value of life. Especially at this moment, the background story, the origin story, which led to the preaching of the Dhamma verse we have taken as our topic, is something </w:t>
+      </w:r>
+      <w:proofErr w:type="gramStart"/>
+      <w:r>
+        <w:t>similar to</w:t>
+      </w:r>
+      <w:proofErr w:type="gramEnd"/>
+      <w:r>
+        <w:t xml:space="preserve"> this.</w:t>
       </w:r>
     </w:p>
     <w:p>
       <w:r>
-        <w:t>Dear Listeners,</w:t>
+        <w:t xml:space="preserve">You have heard about the great treasurer, </w:t>
+      </w:r>
+      <w:proofErr w:type="spellStart"/>
+      <w:r>
+        <w:t>Anāthapiṇḍika</w:t>
+      </w:r>
+      <w:proofErr w:type="spellEnd"/>
+      <w:r>
+        <w:t xml:space="preserve">. In this Dispensation, during the time the Blessed One was residing, among the great Buddhist lay disciples, </w:t>
+      </w:r>
+      <w:proofErr w:type="spellStart"/>
+      <w:r>
+        <w:t>Anāthapiṇḍika</w:t>
+      </w:r>
+      <w:proofErr w:type="spellEnd"/>
+      <w:r>
+        <w:t xml:space="preserve"> the great treasurer was the foremost—worthy of being placed at the very top. He was rich not only in millions of wealth but also in Dhamma-knowledge, and he was a great lay disciple who had also realized the fruit of Stream-entry (*</w:t>
+      </w:r>
+      <w:proofErr w:type="spellStart"/>
+      <w:r>
+        <w:t>Sotāpatti-phala</w:t>
+      </w:r>
+      <w:proofErr w:type="spellEnd"/>
+      <w:r>
+        <w:t xml:space="preserve">*), which is considered a noble supramundane state. The mansion of that treasurer </w:t>
+      </w:r>
+      <w:proofErr w:type="spellStart"/>
+      <w:r>
+        <w:t>Anāthapiṇḍika</w:t>
+      </w:r>
+      <w:proofErr w:type="spellEnd"/>
+      <w:r>
+        <w:t xml:space="preserve"> was entirely an alms-hall. That is, it is mentioned in the Dhamma that it was a mansion that constantly ministered to the Blessed One and the Great </w:t>
+      </w:r>
+      <w:proofErr w:type="spellStart"/>
+      <w:r>
+        <w:t>Saṅgha</w:t>
+      </w:r>
+      <w:proofErr w:type="spellEnd"/>
+      <w:r>
+        <w:t>, or rather to hundreds of monks daily with alms and other provisions.</w:t>
       </w:r>
     </w:p>
     <w:p>
       <w:r>
-        <w:t>Despite the inclement weather today on this full-moon Poya day, you have all gathered here to give your assent to some word of the Dhamma—a specific portion of the Dhamma—of the Blessed One. Buddhist devotees expect to listen to the Dhamma in order to gain some light for their lives, to shape their lives. The Buddha has pointed out that this human life we have obtained is extremely rare (*manussa-jīvitaṁ dullabhaṁ*). Likewise, it is a highly valuable life `[...unclear...]`. It does not come easily. The value or worthlessness of a life is determined by the pattern of life we lead; it is decided by that. Even if a person lives for a hundred years, if they spend their life with worthless things, with things devoid of essence, then that life is indeed futile and essenceless.</w:t>
+        <w:t xml:space="preserve">Fearing that if his son </w:t>
+      </w:r>
+      <w:proofErr w:type="spellStart"/>
+      <w:r>
+        <w:t>Kāla</w:t>
+      </w:r>
+      <w:proofErr w:type="spellEnd"/>
+      <w:r>
+        <w:t xml:space="preserve"> spent his time in this manner he would become a wretched person (*</w:t>
+      </w:r>
+      <w:proofErr w:type="spellStart"/>
+      <w:r>
+        <w:t>kālakaṇṇi</w:t>
+      </w:r>
+      <w:proofErr w:type="spellEnd"/>
+      <w:r>
+        <w:t xml:space="preserve">*), the treasurer </w:t>
+      </w:r>
+      <w:proofErr w:type="spellStart"/>
+      <w:r>
+        <w:t>Anāthapiṇḍika</w:t>
+      </w:r>
+      <w:proofErr w:type="spellEnd"/>
+      <w:r>
+        <w:t xml:space="preserve"> thought of a device, thinking, "I must introduce this child to the Triple Gem." One Poya day, the treasurer </w:t>
+      </w:r>
+      <w:proofErr w:type="spellStart"/>
+      <w:r>
+        <w:t>Anāthapiṇḍika</w:t>
+      </w:r>
+      <w:proofErr w:type="spellEnd"/>
+      <w:r>
+        <w:t xml:space="preserve"> called his son and said, "Son, if you go to the monastery, observe the precepts, listen to the Dhamma from the Blessed One, and return, I will give you a hundred gold coins (*</w:t>
+      </w:r>
+      <w:proofErr w:type="spellStart"/>
+      <w:r>
+        <w:t>masuran</w:t>
+      </w:r>
+      <w:proofErr w:type="spellEnd"/>
+      <w:r>
+        <w:t>*—</w:t>
+      </w:r>
+      <w:proofErr w:type="spellStart"/>
+      <w:r>
+        <w:t>kahāpaṇas</w:t>
+      </w:r>
+      <w:proofErr w:type="spellEnd"/>
+      <w:r>
+        <w:t xml:space="preserve">)." Then this child made his father promise three times, asking, "Will you definitely give it, Father? Will you </w:t>
+      </w:r>
+      <w:proofErr w:type="gramStart"/>
+      <w:r>
+        <w:t>definitely give</w:t>
+      </w:r>
+      <w:proofErr w:type="gramEnd"/>
+      <w:r>
+        <w:t xml:space="preserve"> it, Father? Will you </w:t>
+      </w:r>
+      <w:proofErr w:type="gramStart"/>
+      <w:r>
+        <w:t>definitely give</w:t>
+      </w:r>
+      <w:proofErr w:type="gramEnd"/>
+      <w:r>
+        <w:t xml:space="preserve"> it, Father?" Having made him agree, he then went to </w:t>
+      </w:r>
+      <w:proofErr w:type="spellStart"/>
+      <w:r>
+        <w:t>Jetavana</w:t>
+      </w:r>
+      <w:proofErr w:type="spellEnd"/>
+      <w:r>
+        <w:t xml:space="preserve"> monastery and observed the precepts. But he had no desire to listen to the sermon. He slept in a corner and returned to the mansion the next morning. As soon as he arrived, the treasurer ordered the servants, "My son has returned after observing the precepts, give him good food and drink." But this child, just as some young children say, declared, "I will not eat until I am given the promised money." Therefore, the treasurer had to give the money first. Taking that bag of gold coins in one hand—holding it with one hand—only then did this child even take his food.</w:t>
       </w:r>
     </w:p>
     <w:p>
       <w:r>
-        <w:t xml:space="preserve">Therefore, it is the duty of Buddhist devotees to live having understood the true value, the true essence—the genuine value of a life of virtue. Externally, the world generally values wealth, gold, silver, pearls, and gems. But the Buddha introduced to the world things far more noble than that through the Dhamma. Ultimately, to live according to that value introduced by the Dhamma—to guide one's life accordingly—yesterday was a very valuable day. Thus, today, this group present here... the great Buddhist lay disciples, as revealed to us </w:t>
-      </w:r>
-      <w:r>
-        <w:lastRenderedPageBreak/>
-        <w:t>in the Dhamma stories, use this day to introduce the true value of life to their children. Now, at this moment, we `[...unclear, continues on next page...]`</w:t>
+        <w:t xml:space="preserve">Then, when another Poya day arrived, the treasurer </w:t>
+      </w:r>
+      <w:proofErr w:type="spellStart"/>
+      <w:r>
+        <w:t>Anāthapiṇḍika</w:t>
+      </w:r>
+      <w:proofErr w:type="spellEnd"/>
+      <w:r>
+        <w:t xml:space="preserve"> thought—by way of adding another part to this strategy: "Son, if you go to the monastery, observe the precepts, listen to the Dhamma from the Blessed One, learn a word of Dhamma and return, I will give you a thousand gold coins." This child, because of his desire for this money, went to the monastery, observed the precepts, and went and sat right in front of where the Blessed One was preaching the Dhamma. He prepared to listen to the Dhamma with the intention of somehow learning just one word of Dhamma and running back to get the money.</w:t>
       </w:r>
     </w:p>
     <w:p>
       <w:r>
-        <w:t>You have heard about the great treasurer Anāthapiṇḍika.</w:t>
+        <w:t xml:space="preserve">The Blessed One saw the mind of this child. Moreover, the Blessed One must have seen that despite leading such a life, there was some power of merit within this child. Whatever the case may be, the Blessed One also employed a certain device—a skillful means, a strategy. What was it? He began to preach the Dhamma in such a way that the child could not grasp the word of the Dhamma. This child was hoping to somehow learn a word of Dhamma, go back, and get the money from his father. But the Blessed One was preaching the Dhamma. This child could not grasp even a single word of the Dhamma; somehow, it kept slipping </w:t>
+      </w:r>
+      <w:r>
+        <w:lastRenderedPageBreak/>
+        <w:t xml:space="preserve">away. In this manner, the Buddha began to preach. The child was listening with great attention. Why? Because of his desire for </w:t>
+      </w:r>
+      <w:proofErr w:type="gramStart"/>
+      <w:r>
+        <w:t>the money</w:t>
+      </w:r>
+      <w:proofErr w:type="gramEnd"/>
+      <w:r>
+        <w:t>. However, he could not grasp even a single word of the Dhamma. He failed to grasp the first word of Dhamma. The next one, the next one, and so on, until finally, he had to sit and listen until the entire sermon was finished. But how wonderful was this Dhamma sermon of the Blessed One! By the time it ended, this child had attained that noble supramundane state called Stream-entry, attaining the state of an Ariya (noble one).</w:t>
       </w:r>
     </w:p>
     <w:p>
       <w:r>
-        <w:t>In this dispensation, during the time the Buddha was living, the one who achieved the foremost position among the great lay disciples was the great treasurer Anāthapiṇḍika. He was wealthy not only in material riches but also rich in Dhamma-wisdom, and he was also endowed with noble resourcefulness and skillful means.</w:t>
+        <w:t xml:space="preserve">But no one else knew about this. The next day, when the Blessed One and the </w:t>
+      </w:r>
+      <w:proofErr w:type="spellStart"/>
+      <w:r>
+        <w:t>Saṅgha</w:t>
+      </w:r>
+      <w:proofErr w:type="spellEnd"/>
+      <w:r>
+        <w:t xml:space="preserve"> walked to the mansion of the treasurer </w:t>
+      </w:r>
+      <w:proofErr w:type="spellStart"/>
+      <w:r>
+        <w:t>Anāthapiṇḍika</w:t>
+      </w:r>
+      <w:proofErr w:type="spellEnd"/>
+      <w:r>
+        <w:t xml:space="preserve"> for the </w:t>
+      </w:r>
+      <w:proofErr w:type="gramStart"/>
+      <w:r>
+        <w:t>alms-giving</w:t>
+      </w:r>
+      <w:proofErr w:type="gramEnd"/>
+      <w:r>
+        <w:t xml:space="preserve">, this boy followed behind very calmly. Upon arriving at the house, the great treasurer </w:t>
+      </w:r>
+      <w:proofErr w:type="spellStart"/>
+      <w:r>
+        <w:t>Anāthapiṇḍika</w:t>
+      </w:r>
+      <w:proofErr w:type="spellEnd"/>
+      <w:r>
+        <w:t xml:space="preserve"> offered alms to the Blessed One and the </w:t>
+      </w:r>
+      <w:proofErr w:type="spellStart"/>
+      <w:proofErr w:type="gramStart"/>
+      <w:r>
+        <w:t>Saṅgha</w:t>
+      </w:r>
+      <w:proofErr w:type="spellEnd"/>
+      <w:r>
+        <w:t>, and</w:t>
+      </w:r>
+      <w:proofErr w:type="gramEnd"/>
+      <w:r>
+        <w:t xml:space="preserve"> prepared to give food to the boy at a seat to the side. The treasurer was astonished to see this child being so calm. The child who on other days said, "I will not eat until you give me the money, the </w:t>
+      </w:r>
+      <w:proofErr w:type="spellStart"/>
+      <w:r>
+        <w:t>kahāpaṇas</w:t>
+      </w:r>
+      <w:proofErr w:type="spellEnd"/>
+      <w:r>
+        <w:t xml:space="preserve">," was now eating very calmly. This child also thought, "It would be better if my father did not speak about this money in front of the Blessed One." He felt that embarrassed. He felt embarrassed for having listened to the Dhamma out of greed for money. But the treasurer did not know about this. Therefore, he prepared to bring and give the money next. The child rejected it. He said he did not want it. Because of this, the treasurer said to the Blessed One, "Venerable Sir, my son's </w:t>
+      </w:r>
+      <w:proofErr w:type="gramStart"/>
+      <w:r>
+        <w:t>appearance—his behavior—</w:t>
+      </w:r>
+      <w:proofErr w:type="gramEnd"/>
+      <w:r>
+        <w:t>is very different today. On previous days, he promised in this way and would not eat until he was given the money. Today, even when urged, he did not wish to take the money." At that moment, the Buddha declared: "O Treasurer, today your son has obtained something far more valuable than this money—indeed, far more valuable than even the empire of a wheel-turning monarch over the whole earth, more valuable than going to heaven, more valuable than lordship over the entire world. That is why he is not interested in that money."</w:t>
       </w:r>
     </w:p>
     <w:p>
       <w:r>
-        <w:t>Even so, not everyone in Anāthapiṇḍika's family possessed such Buddhist faith. Although the treasurer's wife, his three daughters (Mahā Subhaddā, Cūḷa Subhaddā, Sumanā), and other relatives were truly devoted to the Buddha's teaching, his only son, a young man named 'Kāla', had no desire even to see the Buddha, to attend on Him, or to listen to the Dhamma.</w:t>
+        <w:t>Declaring thus, he uttered the Dhamma verse we mentioned earlier:</w:t>
       </w:r>
     </w:p>
     <w:p>
       <w:r>
-        <w:t>The treasurer, thinking about this, said to Kāla: "My son, if you go to the monastery, observe the precepts, and return after listening to a sermon from the Buddha, I will give you a thousand gold coins (*kahāpaṇas*)." Motivated by greed for money, Kāla went to the monastery, observed the precepts, and sat close to the Buddha in an attitude of listening to the Dhamma, but in reality, he did not listen to the Dhamma; the next day, he went to his father and demanded the money.</w:t>
+        <w:t>*</w:t>
+      </w:r>
+      <w:proofErr w:type="spellStart"/>
+      <w:r>
+        <w:t>Pathabyā</w:t>
+      </w:r>
+      <w:proofErr w:type="spellEnd"/>
+      <w:r>
+        <w:t xml:space="preserve"> </w:t>
+      </w:r>
+      <w:proofErr w:type="spellStart"/>
+      <w:r>
+        <w:t>ekarajjena</w:t>
+      </w:r>
+      <w:proofErr w:type="spellEnd"/>
+      <w:r>
+        <w:t>*</w:t>
       </w:r>
     </w:p>
     <w:p>
       <w:r>
-        <w:t>Next, the father used another stratagem and said: "This time too, if you go to the monastery, memorize even a single verse of Dhamma from the Buddha, and return, I will give you a thousand gold coins." Kāla went back to the monastery, with the sole intention of obtaining the money, and tried to memorize a Dhamma verse.</w:t>
+        <w:t>*</w:t>
+      </w:r>
+      <w:proofErr w:type="spellStart"/>
+      <w:r>
+        <w:t>Saggassa</w:t>
+      </w:r>
+      <w:proofErr w:type="spellEnd"/>
+      <w:r>
+        <w:t xml:space="preserve"> </w:t>
+      </w:r>
+      <w:proofErr w:type="spellStart"/>
+      <w:r>
+        <w:t>gamanena</w:t>
+      </w:r>
+      <w:proofErr w:type="spellEnd"/>
+      <w:r>
+        <w:t xml:space="preserve"> </w:t>
+      </w:r>
+      <w:proofErr w:type="spellStart"/>
+      <w:r>
+        <w:t>vā</w:t>
+      </w:r>
+      <w:proofErr w:type="spellEnd"/>
+      <w:r>
+        <w:t>*</w:t>
       </w:r>
     </w:p>
     <w:p>
       <w:r>
-        <w:t>The Buddha saw Kāla's mind—He felt that even though this child was behaving this way prompted by greed for money, he possessed some potential merit (*puṇya-śakti*). Therefore, the Buddha employed a skillful means—He began to deliver the Dhamma discourse in such a way that Kāla could not easily grasp even a single word of the Dhamma. When Kāla tried to memorize one phrase, by the time he went to remember the next phrase, he forgot the first phrase. Because this happened, he had to listen closer and closer to the Dhamma.</w:t>
+        <w:t>*</w:t>
+      </w:r>
+      <w:proofErr w:type="spellStart"/>
+      <w:r>
+        <w:t>Sabbalokādhipaccena</w:t>
+      </w:r>
+      <w:proofErr w:type="spellEnd"/>
+      <w:r>
+        <w:t>*</w:t>
       </w:r>
     </w:p>
     <w:p>
       <w:r>
-        <w:t>As this went on, Kāla's mind became more and more inclined toward the Dhamma, and ultimately, he understood the Dhamma and attained the fruit of Stream-entry (*Sotāpatti-phala*).</w:t>
+        <w:t>*</w:t>
+      </w:r>
+      <w:proofErr w:type="spellStart"/>
+      <w:r>
+        <w:t>Sotāpattiphalaṁ</w:t>
+      </w:r>
+      <w:proofErr w:type="spellEnd"/>
+      <w:r>
+        <w:t xml:space="preserve"> </w:t>
+      </w:r>
+      <w:proofErr w:type="spellStart"/>
+      <w:r>
+        <w:t>varaṁ</w:t>
+      </w:r>
+      <w:proofErr w:type="spellEnd"/>
+      <w:r>
+        <w:t>*</w:t>
       </w:r>
     </w:p>
     <w:p>
       <w:r>
-        <w:t xml:space="preserve">The treasurer said to his servants: "My son is returning after observing the precepts, prepare food and drinks well for him." However, when they saw Kāla coming, thinking he was coming to get the promised money, Kāla says to his father, "I do not even need food," and demanded the money first. When Anāthapiṇḍika tried to bring the bag of money and give it to Kāla, even before Kāla could take it in his hand, because his mind had been </w:t>
-      </w:r>
-      <w:r>
-        <w:lastRenderedPageBreak/>
-        <w:t>completely transformed by the power of the Buddha's Dhamma sermon, he rejected that money.</w:t>
+        <w:t>"</w:t>
+      </w:r>
+      <w:proofErr w:type="spellStart"/>
+      <w:r>
+        <w:t>Pathabyā</w:t>
+      </w:r>
+      <w:proofErr w:type="spellEnd"/>
+      <w:r>
+        <w:t xml:space="preserve"> </w:t>
+      </w:r>
+      <w:proofErr w:type="spellStart"/>
+      <w:r>
+        <w:t>ekarajjena</w:t>
+      </w:r>
+      <w:proofErr w:type="spellEnd"/>
+      <w:r>
+        <w:t>"—more than ruling this great earth as a wheel-turning monarch, "</w:t>
+      </w:r>
+      <w:proofErr w:type="spellStart"/>
+      <w:r>
+        <w:t>saggassa</w:t>
+      </w:r>
+      <w:proofErr w:type="spellEnd"/>
+      <w:r>
+        <w:t xml:space="preserve"> </w:t>
+      </w:r>
+      <w:proofErr w:type="spellStart"/>
+      <w:r>
+        <w:t>gamanena</w:t>
+      </w:r>
+      <w:proofErr w:type="spellEnd"/>
+      <w:r>
+        <w:t xml:space="preserve"> </w:t>
+      </w:r>
+      <w:proofErr w:type="spellStart"/>
+      <w:r>
+        <w:t>vā</w:t>
+      </w:r>
+      <w:proofErr w:type="spellEnd"/>
+      <w:r>
+        <w:t>"—more than going to heaven, "</w:t>
+      </w:r>
+      <w:proofErr w:type="spellStart"/>
+      <w:r>
+        <w:t>sabbalokādhipaccena</w:t>
+      </w:r>
+      <w:proofErr w:type="spellEnd"/>
+      <w:r>
+        <w:t>"—more than lordship over the entire world, "</w:t>
+      </w:r>
+      <w:proofErr w:type="spellStart"/>
+      <w:r>
+        <w:t>sotāpattiphalaṁ</w:t>
+      </w:r>
+      <w:proofErr w:type="spellEnd"/>
+      <w:r>
+        <w:t xml:space="preserve"> </w:t>
+      </w:r>
+      <w:proofErr w:type="spellStart"/>
+      <w:r>
+        <w:t>varaṁ</w:t>
+      </w:r>
+      <w:proofErr w:type="spellEnd"/>
+      <w:r>
+        <w:t>"—the fruit of Stream-entry is superior, that supramundane state is superior, declared the Blessed One on that occasion.</w:t>
       </w:r>
     </w:p>
     <w:p>
       <w:r>
-        <w:t>From that point on, Kāla, realizing that the gain of the Dhamma he obtained was far superior to worldly wealth, lived as a Stream-enterer. But no one else in the family knew about this.</w:t>
+        <w:t xml:space="preserve">Thus, from this, we can understand that due to the efforts of the treasurer </w:t>
+      </w:r>
+      <w:proofErr w:type="spellStart"/>
+      <w:r>
+        <w:t>Anāthapiṇḍika</w:t>
+      </w:r>
+      <w:proofErr w:type="spellEnd"/>
+      <w:r>
+        <w:t xml:space="preserve">, the child obtained that state of Stream-entry, which is considered the highest state in the world. </w:t>
+      </w:r>
+      <w:proofErr w:type="gramStart"/>
+      <w:r>
+        <w:t>This</w:t>
+      </w:r>
+      <w:proofErr w:type="gramEnd"/>
+      <w:r>
+        <w:t xml:space="preserve"> fruit of </w:t>
+      </w:r>
+      <w:proofErr w:type="gramStart"/>
+      <w:r>
+        <w:t>Stream-entry</w:t>
+      </w:r>
+      <w:proofErr w:type="gramEnd"/>
+      <w:r>
+        <w:t xml:space="preserve">, this state, is a great change that occurs in the mind. It is called attaining the state of an Ariya (noble one). The freedom one gains by obtaining this </w:t>
+      </w:r>
+      <w:r>
+        <w:lastRenderedPageBreak/>
+        <w:t xml:space="preserve">state is such that one will never again go to the lower realms in this </w:t>
+      </w:r>
+      <w:proofErr w:type="spellStart"/>
+      <w:r>
+        <w:t>saṁsāra</w:t>
+      </w:r>
+      <w:proofErr w:type="spellEnd"/>
+      <w:r>
+        <w:t xml:space="preserve">. The mind never falls to a state low enough to lead to the lower realms. That is the most special strength seen in becoming a Stream-enterer. Thus, if one is to be reborn in </w:t>
+      </w:r>
+      <w:proofErr w:type="spellStart"/>
+      <w:r>
+        <w:t>saṁsāra</w:t>
+      </w:r>
+      <w:proofErr w:type="spellEnd"/>
+      <w:r>
+        <w:t>, it is at most seven times. If one has obtained the fruit of Stream-</w:t>
+      </w:r>
+      <w:proofErr w:type="gramStart"/>
+      <w:r>
+        <w:t>entry in</w:t>
+      </w:r>
+      <w:proofErr w:type="gramEnd"/>
+      <w:r>
+        <w:t xml:space="preserve"> this way</w:t>
+      </w:r>
+      <w:proofErr w:type="gramStart"/>
+      <w:r>
+        <w:t>—to obtain</w:t>
+      </w:r>
+      <w:proofErr w:type="gramEnd"/>
+      <w:r>
+        <w:t xml:space="preserve"> the fruit of Stream-entry means to understand the Four Noble Truths deeply and precisely. Likewise, it means to deeply understand the Three Characteristics in this world—namely, Impermanent (*</w:t>
+      </w:r>
+      <w:proofErr w:type="spellStart"/>
+      <w:r>
+        <w:t>anicca</w:t>
+      </w:r>
+      <w:proofErr w:type="spellEnd"/>
+      <w:r>
+        <w:t>*), Suffering (*dukkha*), and Not-self (*</w:t>
+      </w:r>
+      <w:proofErr w:type="spellStart"/>
+      <w:r>
+        <w:t>anattā</w:t>
+      </w:r>
+      <w:proofErr w:type="spellEnd"/>
+      <w:r>
+        <w:t xml:space="preserve">*). The change that occurs within the mind through that understanding is so great that such a person will never again be born in the lower realms. Furthermore, they will be born at most seven more times in </w:t>
+      </w:r>
+      <w:proofErr w:type="spellStart"/>
+      <w:r>
+        <w:t>saṁsāra</w:t>
+      </w:r>
+      <w:proofErr w:type="spellEnd"/>
+      <w:r>
+        <w:t xml:space="preserve">. After being reborn in that manner, they will somehow, in one way or another, attain </w:t>
+      </w:r>
+      <w:proofErr w:type="spellStart"/>
+      <w:r>
+        <w:t>Arahantship</w:t>
+      </w:r>
+      <w:proofErr w:type="spellEnd"/>
+      <w:r>
+        <w:t xml:space="preserve"> and pass away into final extinguishment (*</w:t>
+      </w:r>
+      <w:proofErr w:type="spellStart"/>
+      <w:r>
+        <w:t>parinibbāna</w:t>
+      </w:r>
+      <w:proofErr w:type="spellEnd"/>
+      <w:r>
+        <w:t xml:space="preserve">*). Such a wonderful change occurs in a person's mind through the state of Stream-entry. Therefore, such a massive transformation, a change, occurred in that child named </w:t>
+      </w:r>
+      <w:proofErr w:type="spellStart"/>
+      <w:r>
+        <w:t>Kāla</w:t>
+      </w:r>
+      <w:proofErr w:type="spellEnd"/>
+      <w:r>
+        <w:t xml:space="preserve"> due to listening to the Dhamma on that day.</w:t>
       </w:r>
     </w:p>
     <w:p>
       <w:r>
-        <w:t>When coming to the treasurer's house, Kāla walked behind quietly and calmly. After going home, the great treasurer Anāthapiṇḍika offered alms to the Buddha and the Sangha, and had also prepared better food than usual for the child. The treasurer was amazed to see the child, who previously used to say "I will not eat food until you give me a thousand gold coins," now eating that food so calmly.</w:t>
+        <w:t xml:space="preserve">What the Blessed One declared regarding the fruit of Stream-entry—its value—as expressed here: being a wheel-turning monarch is a great thing expected by the world, but why is this fruit said to be superior to all of them? Even if one rules the great earth as a wheel-turning monarch, there is still the possibility of going to the lower realms due to the bad </w:t>
+      </w:r>
+      <w:proofErr w:type="spellStart"/>
+      <w:r>
+        <w:t>kamma</w:t>
+      </w:r>
+      <w:proofErr w:type="spellEnd"/>
+      <w:r>
+        <w:t xml:space="preserve"> one has done in </w:t>
+      </w:r>
+      <w:proofErr w:type="spellStart"/>
+      <w:r>
+        <w:t>saṁsāra</w:t>
+      </w:r>
+      <w:proofErr w:type="spellEnd"/>
+      <w:r>
+        <w:t xml:space="preserve">. But the Stream-enterer never goes to the lower realms. That is why it was declared that the fruit of Stream-entry is superior to everything else. The Blessed One has shown the value of this fruit of </w:t>
+      </w:r>
+      <w:proofErr w:type="gramStart"/>
+      <w:r>
+        <w:t>Stream-entry</w:t>
+      </w:r>
+      <w:proofErr w:type="gramEnd"/>
+      <w:r>
+        <w:t xml:space="preserve"> on many occasions. On one occasion, taking a little soil on his fingernail, he asked the monks, "Is the soil on this fingernail greater, or is the soil of the entire great earth greater?" Then the monks declared, "Venerable Sir, Blessed One, the soil on your fingernail is very little. The soil of the great earth is far greater." In accordance with that simile, the Blessed One declared: "Even so, monks, for the Stream-enterer, the amount of Suffering (*dukkha*) they have freed themselves from in this </w:t>
+      </w:r>
+      <w:proofErr w:type="spellStart"/>
+      <w:r>
+        <w:t>saṁsāra</w:t>
+      </w:r>
+      <w:proofErr w:type="spellEnd"/>
+      <w:r>
+        <w:t xml:space="preserve"> is like the soil of the great earth. The amount of Suffering (*dukkha*) remaining, the amount of Suffering (*dukkha*) left to be spent, is extremely small, like the soil on this fingernail." The Stream-enterer receives </w:t>
+      </w:r>
+      <w:proofErr w:type="gramStart"/>
+      <w:r>
+        <w:t>such a</w:t>
+      </w:r>
+      <w:proofErr w:type="gramEnd"/>
+      <w:r>
+        <w:t xml:space="preserve"> vast freedom. This fruit of Stream-entry is the first of the supramundane states. In this Dispensation of the Buddha, there are four paths and fruits: Stream-entry, Once-returning, Non-returning, and </w:t>
+      </w:r>
+      <w:proofErr w:type="spellStart"/>
+      <w:r>
+        <w:t>Arahantship</w:t>
+      </w:r>
+      <w:proofErr w:type="spellEnd"/>
+      <w:r>
+        <w:t xml:space="preserve">. It is through these that one realizes </w:t>
+      </w:r>
+      <w:proofErr w:type="spellStart"/>
+      <w:r>
+        <w:t>Nibbāna</w:t>
+      </w:r>
+      <w:proofErr w:type="spellEnd"/>
+      <w:r>
+        <w:t xml:space="preserve">. Finally, through the state of </w:t>
+      </w:r>
+      <w:proofErr w:type="spellStart"/>
+      <w:r>
+        <w:t>Arahantship</w:t>
+      </w:r>
+      <w:proofErr w:type="spellEnd"/>
+      <w:r>
+        <w:t xml:space="preserve">, one is completely pacified by the supreme </w:t>
+      </w:r>
+      <w:proofErr w:type="spellStart"/>
+      <w:r>
+        <w:t>Nibbāna</w:t>
+      </w:r>
+      <w:proofErr w:type="spellEnd"/>
+      <w:r>
+        <w:t xml:space="preserve">, bringing an end to the Suffering (*dukkha*) of </w:t>
+      </w:r>
+      <w:proofErr w:type="spellStart"/>
+      <w:r>
+        <w:t>saṁsāra</w:t>
+      </w:r>
+      <w:proofErr w:type="spellEnd"/>
+      <w:r>
+        <w:t>. Thus, the Blessed One declared that even the fruit of Stream-entry is such a noble thing.</w:t>
       </w:r>
     </w:p>
     <w:p>
       <w:r>
-        <w:t>The child felt embarrassed—thinking, "It would be better if this talk about money is not mentioned in front of the Buddha"—even feeling ashamed that he had listened to the Dhamma out of greed for money. But the treasurer did not know about this. Therefore, when he next tried to bring and give this money, the child rejected it. Thinking that this was strange, the father declared to the Buddha: "Venerable Sir, my son's behavior and manner today is very different. On previous days, he would not eat food until the promised money was given as agreed; today, even when urged, he does not wish to take the money." At that moment, the Buddha declared, "O Treasurer, today your son has received something far more valuable than this money—something more valuable than sole sovereignty over this entire earth, more valuable than going to heaven, more valuable than lordship over the whole world. That is why he is not interested in that money."</w:t>
+        <w:t xml:space="preserve">Now, it might occur to you: how did this young child obtain such a great thing? One might wonder how he obtained such a noble supramundane state. How did this child, who did not minister to the </w:t>
+      </w:r>
+      <w:proofErr w:type="spellStart"/>
+      <w:r>
+        <w:t>Saṅgha</w:t>
+      </w:r>
+      <w:proofErr w:type="spellEnd"/>
+      <w:r>
+        <w:t xml:space="preserve"> in that manner and did not even want to see the Blessed One, achieve such a great victory—such a high state—just by listening to a single Dhamma sermon of the Blessed One? This is a good opportunity for us to think deeply. Generally, to obtain such great states—as you, lay devotees, know—one </w:t>
+      </w:r>
+      <w:proofErr w:type="gramStart"/>
+      <w:r>
+        <w:t>has to</w:t>
+      </w:r>
+      <w:proofErr w:type="gramEnd"/>
+      <w:r>
+        <w:t xml:space="preserve"> practice a lot of meditation. How then did this child obtain it? One might ask, "Was it without meditation?" But, virtuous friends, </w:t>
+      </w:r>
+      <w:r>
+        <w:lastRenderedPageBreak/>
+        <w:t xml:space="preserve">without meditation, </w:t>
+      </w:r>
+      <w:proofErr w:type="spellStart"/>
+      <w:r>
+        <w:t>Nibbāna</w:t>
+      </w:r>
+      <w:proofErr w:type="spellEnd"/>
+      <w:r>
+        <w:t xml:space="preserve"> is not found. Now let us examine a little what kind of meditation was present in this child.</w:t>
       </w:r>
     </w:p>
     <w:p>
       <w:r>
-        <w:t>While declaring this, He uttered the stanza mentioned earlier:</w:t>
+        <w:t>Although it is not detailed in this story, we can infer, through certain hints within it, what the meditation in this child's mind was. Regarding everything in this world and this life, there are Three Characteristics that the Blessed One declared. Everything is Impermanent (*</w:t>
+      </w:r>
+      <w:proofErr w:type="spellStart"/>
+      <w:r>
+        <w:t>anicca</w:t>
+      </w:r>
+      <w:proofErr w:type="spellEnd"/>
+      <w:r>
+        <w:t>*). Everything is, when viewed ultimately, Suffering (*dukkha*). Likewise, everything cannot be taken as "myself" or "mine"—it is Not-self (*</w:t>
+      </w:r>
+      <w:proofErr w:type="spellStart"/>
+      <w:r>
+        <w:t>anattā</w:t>
+      </w:r>
+      <w:proofErr w:type="spellEnd"/>
+      <w:r>
+        <w:t>*). This is the profound Dhamma that lies here. That is what is called the "Three Characteristics" (*</w:t>
+      </w:r>
+      <w:proofErr w:type="spellStart"/>
+      <w:r>
+        <w:t>ti-lakkhaṇa</w:t>
+      </w:r>
+      <w:proofErr w:type="spellEnd"/>
+      <w:r>
+        <w:t xml:space="preserve">*)—the three marks present in the entire world. These three marks do not appear to ordinary understanding. They do not appear to the ordinary </w:t>
+      </w:r>
+      <w:proofErr w:type="gramStart"/>
+      <w:r>
+        <w:t>worldly person</w:t>
+      </w:r>
+      <w:proofErr w:type="gramEnd"/>
+      <w:r>
+        <w:t>. This appears only to deep insight (*</w:t>
+      </w:r>
+      <w:proofErr w:type="spellStart"/>
+      <w:r>
+        <w:t>vipassanā</w:t>
+      </w:r>
+      <w:proofErr w:type="spellEnd"/>
+      <w:r>
+        <w:t>*)—to the wisdom that has gone deep. How then did that child obtain this understanding? Generally, this is obtained by meditating according to a subject of meditation (*</w:t>
+      </w:r>
+      <w:proofErr w:type="spellStart"/>
+      <w:r>
+        <w:t>kammaṭṭhāna</w:t>
+      </w:r>
+      <w:proofErr w:type="spellEnd"/>
+      <w:r>
+        <w:t xml:space="preserve">*). Now, what was </w:t>
+      </w:r>
+      <w:proofErr w:type="spellStart"/>
+      <w:r>
+        <w:t>Kāla's</w:t>
+      </w:r>
+      <w:proofErr w:type="spellEnd"/>
+      <w:r>
+        <w:t xml:space="preserve"> subject of meditation? Let us think about it. </w:t>
+      </w:r>
+      <w:proofErr w:type="spellStart"/>
+      <w:r>
+        <w:t>Kāla's</w:t>
+      </w:r>
+      <w:proofErr w:type="spellEnd"/>
+      <w:r>
+        <w:t xml:space="preserve"> subject of meditation was the words of the treasurer </w:t>
+      </w:r>
+      <w:proofErr w:type="spellStart"/>
+      <w:r>
+        <w:t>Anāthapiṇḍika</w:t>
+      </w:r>
+      <w:proofErr w:type="spellEnd"/>
+      <w:r>
+        <w:t>: "Son, if you go and learn a word of the Dhamma and return, I will give you a thousand gold coins."</w:t>
       </w:r>
     </w:p>
     <w:p>
       <w:r>
-        <w:t>&gt; *Pathavyā ekarajjena*</w:t>
+        <w:t xml:space="preserve">Thus, this child must have gone to the monastery with this bag of gold coins in mind, with the idea, "I will somehow listen to a word of the Dhamma and obtain these gold coins." With a certain calmness of mind born of that, he prepared to listen to the Dhamma. But how did the Blessed One clean up this subject of meditation—arrange it—and bring it close to </w:t>
+      </w:r>
+      <w:proofErr w:type="spellStart"/>
+      <w:r>
+        <w:t>Nibbāna</w:t>
+      </w:r>
+      <w:proofErr w:type="spellEnd"/>
+      <w:r>
+        <w:t>? Knowing this matter, the Blessed One began to preach the Dhamma in such a way that the boy could not grasp even a single word. Then this child tried to grasp the first word of Dhamma. To him, every word of Dhamma the Blessed One uttered must have appeared as a bag of gold coins. Even to anyone, sometimes what they desire very much appears as if in a dream, doesn't it? If there is a strong desire for something, that is what appears to the mind. Similarly, now, due to his desire for this bag of gold coins, when he sat in front of the Blessed One and listened to the Dhamma, every word of Dhamma appeared to this child as a bag of gold coins. So, he tried to grasp that first bag of gold coins. At the same time, it somehow slipped away. He tried to grasp the next one: "Ah, I missed that one too." He tried to grasp the next. Thinking in this manner, this child listened to the Dhamma preached by the Blessed One, word by word. At that moment, as he went a bit further, when each bag of gold coins kept slipping away, it must have occurred to him: "Not even one of these can be grasped. All of these are passing away. Everything here is Impermanent (*</w:t>
+      </w:r>
+      <w:proofErr w:type="spellStart"/>
+      <w:r>
+        <w:t>anicca</w:t>
+      </w:r>
+      <w:proofErr w:type="spellEnd"/>
+      <w:r>
+        <w:t xml:space="preserve">*). </w:t>
+      </w:r>
+      <w:proofErr w:type="gramStart"/>
+      <w:r>
+        <w:t>Not a single one</w:t>
+      </w:r>
+      <w:proofErr w:type="gramEnd"/>
+      <w:r>
+        <w:t xml:space="preserve"> can be grasped. They come and go. There is only the preparation to grasp a word of Dhamma here."</w:t>
       </w:r>
     </w:p>
     <w:p>
       <w:r>
-        <w:t>&gt; *Saggassa gamanena vā*</w:t>
+        <w:t>Now, you might occasionally see banners of white cloth hung in front of funeral houses on the road, with words written on them: "</w:t>
+      </w:r>
+      <w:proofErr w:type="spellStart"/>
+      <w:r>
+        <w:t>Sabbē</w:t>
+      </w:r>
+      <w:proofErr w:type="spellEnd"/>
+      <w:r>
+        <w:t xml:space="preserve"> </w:t>
+      </w:r>
+      <w:proofErr w:type="spellStart"/>
+      <w:r>
+        <w:t>saṅkhārā</w:t>
+      </w:r>
+      <w:proofErr w:type="spellEnd"/>
+      <w:r>
+        <w:t xml:space="preserve"> </w:t>
+      </w:r>
+      <w:proofErr w:type="spellStart"/>
+      <w:r>
+        <w:t>aniccā</w:t>
+      </w:r>
+      <w:proofErr w:type="spellEnd"/>
+      <w:r>
+        <w:t>." Such a word of the Dhamma is written. What is the meaning of this? "</w:t>
+      </w:r>
+      <w:proofErr w:type="spellStart"/>
+      <w:r>
+        <w:t>Sabbē</w:t>
+      </w:r>
+      <w:proofErr w:type="spellEnd"/>
+      <w:r>
+        <w:t xml:space="preserve"> </w:t>
+      </w:r>
+      <w:proofErr w:type="spellStart"/>
+      <w:r>
+        <w:t>saṅkhārā</w:t>
+      </w:r>
+      <w:proofErr w:type="spellEnd"/>
+      <w:r>
+        <w:t xml:space="preserve"> </w:t>
+      </w:r>
+      <w:proofErr w:type="spellStart"/>
+      <w:r>
+        <w:t>aniccā</w:t>
+      </w:r>
+      <w:proofErr w:type="spellEnd"/>
+      <w:r>
+        <w:t xml:space="preserve">"—"All </w:t>
+      </w:r>
+      <w:proofErr w:type="gramStart"/>
+      <w:r>
+        <w:t>Formations  are</w:t>
+      </w:r>
+      <w:proofErr w:type="gramEnd"/>
+      <w:r>
+        <w:t xml:space="preserve"> Impermanent." "</w:t>
+      </w:r>
+      <w:proofErr w:type="spellStart"/>
+      <w:r>
+        <w:t>Aniccā</w:t>
+      </w:r>
+      <w:proofErr w:type="spellEnd"/>
+      <w:r>
+        <w:t xml:space="preserve"> </w:t>
+      </w:r>
+      <w:proofErr w:type="spellStart"/>
+      <w:r>
+        <w:t>vata</w:t>
+      </w:r>
+      <w:proofErr w:type="spellEnd"/>
+      <w:r>
+        <w:t xml:space="preserve"> </w:t>
+      </w:r>
+      <w:proofErr w:type="spellStart"/>
+      <w:r>
+        <w:t>saṅkhārā</w:t>
+      </w:r>
+      <w:proofErr w:type="spellEnd"/>
+      <w:r>
+        <w:t>"—"Formations (*</w:t>
+      </w:r>
+      <w:proofErr w:type="spellStart"/>
+      <w:r>
+        <w:t>saṅkhāra</w:t>
+      </w:r>
+      <w:proofErr w:type="spellEnd"/>
+      <w:r>
+        <w:t>*) are indeed Impermanent (*</w:t>
+      </w:r>
+      <w:proofErr w:type="spellStart"/>
+      <w:r>
+        <w:t>anicca</w:t>
+      </w:r>
+      <w:proofErr w:type="spellEnd"/>
+      <w:r>
+        <w:t>*)." What are these things called Formations (*</w:t>
+      </w:r>
+      <w:proofErr w:type="spellStart"/>
+      <w:r>
+        <w:t>saṅkhāra</w:t>
+      </w:r>
+      <w:proofErr w:type="spellEnd"/>
+      <w:r>
+        <w:t xml:space="preserve">*)? In words we can </w:t>
+      </w:r>
+      <w:proofErr w:type="gramStart"/>
+      <w:r>
+        <w:t>understand:</w:t>
+      </w:r>
+      <w:proofErr w:type="gramEnd"/>
+      <w:r>
+        <w:t xml:space="preserve"> preparations, designs, or constructions. Now let us think about </w:t>
+      </w:r>
+      <w:r>
+        <w:lastRenderedPageBreak/>
+        <w:t>"preparation." After a person dies, if we think of "</w:t>
+      </w:r>
+      <w:proofErr w:type="spellStart"/>
+      <w:r>
+        <w:t>Aniccā</w:t>
+      </w:r>
+      <w:proofErr w:type="spellEnd"/>
+      <w:r>
+        <w:t xml:space="preserve"> </w:t>
+      </w:r>
+      <w:proofErr w:type="spellStart"/>
+      <w:r>
+        <w:t>vata</w:t>
+      </w:r>
+      <w:proofErr w:type="spellEnd"/>
+      <w:r>
+        <w:t xml:space="preserve"> </w:t>
+      </w:r>
+      <w:proofErr w:type="spellStart"/>
+      <w:r>
+        <w:t>saṅkhārā</w:t>
+      </w:r>
+      <w:proofErr w:type="spellEnd"/>
+      <w:r>
+        <w:t>" in a way we can understand: what did this human being do while alive? Everything they did was a pile of preparations. What this person did as their entire life was a pile of preparations and designs. If they did anything called merit or demerit, if they did various things through body, speech, and mind—all of those, when viewed from one perspective, are a vast number of preparations and designs. When reflecting on life, all the activities done from morning till night, when examined, are nothing but a pile of preparations. It is like preparing to go on a journey. Even this inhalation and exhalation, breathing itself—all of this is a pile of preparations. Thus, the only work that deceased person did throughout their entire life—without fail—was breathing. When even this breathing came to an end, all the preparations and designs that this person made to live came to an end there. They are Impermanent (*</w:t>
+      </w:r>
+      <w:proofErr w:type="spellStart"/>
+      <w:r>
+        <w:t>anicca</w:t>
+      </w:r>
+      <w:proofErr w:type="spellEnd"/>
+      <w:r>
+        <w:t>*); there is no permanent state. It is so regarding everything.</w:t>
       </w:r>
     </w:p>
     <w:p>
       <w:r>
-        <w:t>&gt; *Sabbalokādhipaccena*</w:t>
+        <w:t xml:space="preserve">So, if we consider this child, he was hoping to grasp a word of Dhamma. Later, when he looked, there was only the preparation to grasp the word of Dhamma. He prepared, but it </w:t>
+      </w:r>
+      <w:proofErr w:type="gramStart"/>
+      <w:r>
+        <w:t>did not succeed</w:t>
+      </w:r>
+      <w:proofErr w:type="gramEnd"/>
+      <w:r>
+        <w:t xml:space="preserve">. He looked at the next; there too, it was </w:t>
+      </w:r>
+      <w:proofErr w:type="gramStart"/>
+      <w:r>
+        <w:t>a preparation</w:t>
+      </w:r>
+      <w:proofErr w:type="gramEnd"/>
+      <w:r>
+        <w:t>. In this way, it must have occurred to this child: "This is what is called Formations (*</w:t>
+      </w:r>
+      <w:proofErr w:type="spellStart"/>
+      <w:r>
+        <w:t>saṅkhāra</w:t>
+      </w:r>
+      <w:proofErr w:type="spellEnd"/>
+      <w:r>
+        <w:t>*). Here there is only a pile of preparations. All of these are Impermanent (*</w:t>
+      </w:r>
+      <w:proofErr w:type="spellStart"/>
+      <w:r>
+        <w:t>anicca</w:t>
+      </w:r>
+      <w:proofErr w:type="spellEnd"/>
+      <w:r>
+        <w:t>*). These preparations, constructions—all of these are Impermanent (*</w:t>
+      </w:r>
+      <w:proofErr w:type="spellStart"/>
+      <w:r>
+        <w:t>anicca</w:t>
+      </w:r>
+      <w:proofErr w:type="spellEnd"/>
+      <w:r>
+        <w:t xml:space="preserve">*)." Because he could not grasp even a single word of Dhamma. It kept slipping away. This was due to a certain device employed by </w:t>
+      </w:r>
+      <w:proofErr w:type="gramStart"/>
+      <w:r>
+        <w:t>the Blessed</w:t>
+      </w:r>
+      <w:proofErr w:type="gramEnd"/>
+      <w:r>
+        <w:t xml:space="preserve"> One. Through this, then, this child looked at his own mind. What is happening inside this mind? Inside the mind, bags of gold coins are arising very rapidly—thoughts like bags of gold coins. In that manner, the bag of gold coins comes and goes, arises and ceases. When reflecting deeply on Impermanence (*</w:t>
+      </w:r>
+      <w:proofErr w:type="spellStart"/>
+      <w:r>
+        <w:t>aniccata</w:t>
+      </w:r>
+      <w:proofErr w:type="spellEnd"/>
+      <w:r>
+        <w:t>*), here there is only arising and ceasing, coming and going. Seeing this state, it must have occurred to this child: "These are Formations (*</w:t>
+      </w:r>
+      <w:proofErr w:type="spellStart"/>
+      <w:r>
+        <w:t>saṅkhāra</w:t>
+      </w:r>
+      <w:proofErr w:type="spellEnd"/>
+      <w:r>
+        <w:t>*)—all of these are just a pile of preparations and designs. They come and go, come and go." Thus, next, the effort to grasp these Formations (*</w:t>
+      </w:r>
+      <w:proofErr w:type="spellStart"/>
+      <w:r>
+        <w:t>saṅkhāra</w:t>
+      </w:r>
+      <w:proofErr w:type="spellEnd"/>
+      <w:r>
+        <w:t>*) which have the nature of coming and going is that very effort to grasp the word of Dhamma.</w:t>
       </w:r>
     </w:p>
     <w:p>
       <w:r>
-        <w:t>&gt; *Sotāpattiphalaṁ varaṁ*</w:t>
+        <w:t xml:space="preserve">After a while, this child must have felt a weariness in this. This effort was </w:t>
+      </w:r>
+      <w:proofErr w:type="gramStart"/>
+      <w:r>
+        <w:t>proving</w:t>
+      </w:r>
+      <w:proofErr w:type="gramEnd"/>
+      <w:r>
+        <w:t xml:space="preserve"> futile. </w:t>
+      </w:r>
+      <w:proofErr w:type="gramStart"/>
+      <w:r>
+        <w:t>Not a single one</w:t>
+      </w:r>
+      <w:proofErr w:type="gramEnd"/>
+      <w:r>
+        <w:t xml:space="preserve"> succeeded. Then, after a while, to the point of becoming disgusted with it, to the point where the thought of the bag of gold coins vanished, this appeared as a great trouble. He tried to "grasp" every word of Dhamma, but none was caught. So, as this went on, the child must have understood the second characteristic declared by the Blessed One: "All of these are Suffering (*dukkha*). All these Formations (*</w:t>
+      </w:r>
+      <w:proofErr w:type="spellStart"/>
+      <w:r>
+        <w:t>saṅkhāra</w:t>
+      </w:r>
+      <w:proofErr w:type="spellEnd"/>
+      <w:r>
+        <w:t>*) are Impermanent (*</w:t>
+      </w:r>
+      <w:proofErr w:type="spellStart"/>
+      <w:r>
+        <w:t>anicca</w:t>
+      </w:r>
+      <w:proofErr w:type="spellEnd"/>
+      <w:r>
+        <w:t>*). Whatever is Impermanent (*</w:t>
+      </w:r>
+      <w:proofErr w:type="spellStart"/>
+      <w:r>
+        <w:t>anicca</w:t>
+      </w:r>
+      <w:proofErr w:type="spellEnd"/>
+      <w:r>
+        <w:t>*) is Suffering (*dukkha*)." "</w:t>
+      </w:r>
+      <w:proofErr w:type="spellStart"/>
+      <w:r>
+        <w:t>Yadaniccaṁ</w:t>
+      </w:r>
+      <w:proofErr w:type="spellEnd"/>
+      <w:r>
+        <w:t xml:space="preserve"> </w:t>
+      </w:r>
+      <w:proofErr w:type="spellStart"/>
+      <w:r>
+        <w:t>taṁ</w:t>
+      </w:r>
+      <w:proofErr w:type="spellEnd"/>
+      <w:r>
+        <w:t xml:space="preserve"> </w:t>
+      </w:r>
+      <w:proofErr w:type="spellStart"/>
+      <w:r>
+        <w:t>dukkhaṁ</w:t>
+      </w:r>
+      <w:proofErr w:type="spellEnd"/>
+      <w:r>
+        <w:t>"—"Whatever is Impermanent (*</w:t>
+      </w:r>
+      <w:proofErr w:type="spellStart"/>
+      <w:r>
+        <w:t>anicca</w:t>
+      </w:r>
+      <w:proofErr w:type="spellEnd"/>
+      <w:r>
+        <w:t>*), that is Suffering (*dukkha*)," declared the Blessed One. Then, next, the Blessed One declared another thing: "</w:t>
+      </w:r>
+      <w:proofErr w:type="spellStart"/>
+      <w:r>
+        <w:t>Yaṁ</w:t>
+      </w:r>
+      <w:proofErr w:type="spellEnd"/>
+      <w:r>
+        <w:t xml:space="preserve"> </w:t>
+      </w:r>
+      <w:proofErr w:type="spellStart"/>
+      <w:r>
+        <w:t>dukkhaṁ</w:t>
+      </w:r>
+      <w:proofErr w:type="spellEnd"/>
+      <w:r>
+        <w:t xml:space="preserve"> </w:t>
+      </w:r>
+      <w:proofErr w:type="spellStart"/>
+      <w:r>
+        <w:t>tadanattā</w:t>
+      </w:r>
+      <w:proofErr w:type="spellEnd"/>
+      <w:r>
+        <w:t>"—"Whatever is Suffering (*dukkha*), that is Not-self (*</w:t>
+      </w:r>
+      <w:proofErr w:type="spellStart"/>
+      <w:r>
+        <w:t>anattā</w:t>
+      </w:r>
+      <w:proofErr w:type="spellEnd"/>
+      <w:r>
+        <w:t>*)." It cannot be taken as "myself" or "mine." Perhaps this too became clear to this child. Now, minds like those bags of gold coins arise and slip away. Not even one remains. That nothing remains, that there is no essence or core in any of them, is what is called Not-self (*</w:t>
+      </w:r>
+      <w:proofErr w:type="spellStart"/>
+      <w:r>
+        <w:t>anattā</w:t>
+      </w:r>
+      <w:proofErr w:type="spellEnd"/>
+      <w:r>
+        <w:t>*). There is nothing to be taken as "myself" or "</w:t>
+      </w:r>
+      <w:proofErr w:type="gramStart"/>
+      <w:r>
+        <w:t>mine"—</w:t>
+      </w:r>
+      <w:proofErr w:type="gramEnd"/>
+      <w:r>
+        <w:t xml:space="preserve">nothing to "grasp." There is no core. All thoughts arise and are swept away. Next, the nature of these thoughts was deeply reflected upon by </w:t>
+      </w:r>
+      <w:r>
+        <w:lastRenderedPageBreak/>
+        <w:t xml:space="preserve">this child. "Here there is entirely a pile of thoughts. They arise and cease. There is no core. There is nothing to grasp here </w:t>
+      </w:r>
+      <w:proofErr w:type="gramStart"/>
+      <w:r>
+        <w:t>as</w:t>
+      </w:r>
+      <w:proofErr w:type="gramEnd"/>
+      <w:r>
+        <w:t xml:space="preserve"> 'myself' or 'mine'; nothing to be caught."</w:t>
       </w:r>
     </w:p>
     <w:p>
       <w:r>
-        <w:t>"Pathavyā ekarajjena"—rather than ruling as sole sovereign over the great earth; "saggassa gamanena vā"—rather than going to heaven; "sabbalokādhipaccena"—rather than lordship over the world; "sotāpattiphalaṁ varaṁ"—the fruit of Stream-entry is supreme. The Buddha declared at that moment that the gain of Dhamma is superior to worldly gain.</w:t>
+        <w:t>The simile the Blessed One has given for this word 'Formations' (*</w:t>
+      </w:r>
+      <w:proofErr w:type="spellStart"/>
+      <w:r>
+        <w:t>saṅkhāra</w:t>
+      </w:r>
+      <w:proofErr w:type="spellEnd"/>
+      <w:r>
+        <w:t>*) is a very wonderful one. We can easily understand this. The Blessed One declared: "</w:t>
+      </w:r>
+      <w:proofErr w:type="spellStart"/>
+      <w:r>
+        <w:t>Saṅkhārā</w:t>
+      </w:r>
+      <w:proofErr w:type="spellEnd"/>
+      <w:r>
+        <w:t xml:space="preserve"> </w:t>
+      </w:r>
+      <w:proofErr w:type="spellStart"/>
+      <w:r>
+        <w:t>kadalūpamā</w:t>
+      </w:r>
+      <w:proofErr w:type="spellEnd"/>
+      <w:r>
+        <w:t>"—"Formations (*</w:t>
+      </w:r>
+      <w:proofErr w:type="spellStart"/>
+      <w:r>
+        <w:t>saṅkhāra</w:t>
+      </w:r>
+      <w:proofErr w:type="spellEnd"/>
+      <w:r>
+        <w:t xml:space="preserve">*) are like a banana trunk." You all know what a banana trunk is. Now </w:t>
+      </w:r>
+      <w:proofErr w:type="gramStart"/>
+      <w:r>
+        <w:t>the Blessed</w:t>
+      </w:r>
+      <w:proofErr w:type="gramEnd"/>
+      <w:r>
+        <w:t xml:space="preserve"> One shows it </w:t>
+      </w:r>
+      <w:proofErr w:type="gramStart"/>
+      <w:r>
+        <w:t>like</w:t>
+      </w:r>
+      <w:proofErr w:type="gramEnd"/>
+      <w:r>
+        <w:t xml:space="preserve"> a good story. Suppose there is someone who has never seen a banana tree. When they go to a forest, they see a banana tree for the first time. Looking at it, this banana trunk is very straight. They think there is a core inside it. They cut it at the top and bottom and carry it home on their shoulder, thinking, "I can make a wardrobe or a chair out of the core of this." Having brought it home—the Blessed One gives this </w:t>
+      </w:r>
+      <w:proofErr w:type="gramStart"/>
+      <w:r>
+        <w:t>simile</w:t>
+      </w:r>
+      <w:proofErr w:type="gramEnd"/>
+      <w:r>
+        <w:t xml:space="preserve">, not us; we are only adding other details to explain it a bit </w:t>
+      </w:r>
+      <w:proofErr w:type="gramStart"/>
+      <w:r>
+        <w:t>more—</w:t>
+      </w:r>
+      <w:proofErr w:type="gramEnd"/>
+      <w:r>
+        <w:t>he first peels off a sheath of this banana trunk, expecting there to be a core. Next, he sees there is another sheath. There is yet another sheath. One by one, he peels off the sheaths. Finally, he reaches the innermost core. There is only a pile of sheaths. Looking at it in that way, that person realizes for the first time by themselves that there is absolutely no core in a banana tree.</w:t>
       </w:r>
     </w:p>
     <w:p>
       <w:r>
-        <w:t>So, according to this, we can also realize that due to the effort of the treasurer Anāthapiṇḍika, the child obtained that state of Stream-entry which the world considers to be highly noble. The attainment of the fruit of Stream-entry,</w:t>
-      </w:r>
-      <w:r>
-        <w:t xml:space="preserve"> </w:t>
-      </w:r>
-      <w:r>
-        <w:t>that state, is a massive and irreversible change, which is why it is said to be received all at once. How great is the freedom a person gains by attaining the fruit of Stream-entry? Such a one will never again go to the lower realms (*apāya*) in this *saṁsāra*. It is the supreme peace obtained by the eradication of impurities of mind to the extent of going to the lower realms. If one is born again, one is born only as a human or a divine being.</w:t>
+        <w:t>That is the kind of simile the Blessed One gives for this word 'Formations' (*</w:t>
+      </w:r>
+      <w:proofErr w:type="spellStart"/>
+      <w:r>
+        <w:t>saṅkhāra</w:t>
+      </w:r>
+      <w:proofErr w:type="spellEnd"/>
+      <w:r>
+        <w:t>*). Now we have expressed this in a word we can understand: "preparation," "designing," or "construction." Thus, when reflecting on the things done throughout this entire life, there is such a nature in every single one of them—one thing for the sake of another, one thing for the sake of another, and as you go on looking at each of them, there is no core in any of them. All of them are Impermanent (*</w:t>
+      </w:r>
+      <w:proofErr w:type="spellStart"/>
+      <w:r>
+        <w:t>anicca</w:t>
+      </w:r>
+      <w:proofErr w:type="spellEnd"/>
+      <w:r>
+        <w:t xml:space="preserve">*). Because of that impermanent nature itself—now, in the life of a young child, there are wishes and expectations. Whether those expectations are fulfilled or not, in a few days they </w:t>
+      </w:r>
+      <w:proofErr w:type="gramStart"/>
+      <w:r>
+        <w:t>become a youth</w:t>
+      </w:r>
+      <w:proofErr w:type="gramEnd"/>
+      <w:r>
+        <w:t xml:space="preserve">. </w:t>
+      </w:r>
+      <w:proofErr w:type="gramStart"/>
+      <w:r>
+        <w:t>The youth</w:t>
+      </w:r>
+      <w:proofErr w:type="gramEnd"/>
+      <w:r>
+        <w:t xml:space="preserve"> also </w:t>
+      </w:r>
+      <w:proofErr w:type="gramStart"/>
+      <w:r>
+        <w:t>has</w:t>
+      </w:r>
+      <w:proofErr w:type="gramEnd"/>
+      <w:r>
+        <w:t xml:space="preserve"> various expectations—even before they are fulfilled, they are either destroyed, or, without even knowing it, old age arrives. The old person also has various expectations. Even before they can fulfill them, sometimes, they die. In this manner, the entire life consists of a pile of preparations and designs.</w:t>
       </w:r>
     </w:p>
     <w:p>
       <w:r>
-        <w:t xml:space="preserve">What does it mean to obtain the fruit of Stream-entry in this manner? It means to deeply realize the Four Noble Truths. It also means to deeply understand the Three Characteristics (*ti-lakkhaṇa*) of the world: </w:t>
-      </w:r>
-      <w:r>
-        <w:t>*Anicca* (Impermanent)</w:t>
-      </w:r>
-      <w:r>
-        <w:t xml:space="preserve">, </w:t>
-      </w:r>
-      <w:r>
-        <w:t>*Dukkha* (Suffering)</w:t>
-      </w:r>
-      <w:r>
-        <w:t xml:space="preserve">, and </w:t>
-      </w:r>
-      <w:r>
-        <w:t>*Anattā* (Not-self)</w:t>
-      </w:r>
-      <w:r>
-        <w:t>. The transformation of the mind that occurs through this understanding is so profound that such a person will never again be born in the lower worlds. Furthermore, they will be reborn in *saṁsāra* at most seven times. After such births, they will somehow attain Arahantship and pass away into final extinguishment (*pari</w:t>
-      </w:r>
-      <w:r>
-        <w:t>Nibbāna</w:t>
-      </w:r>
-      <w:r>
-        <w:t>. Such a miraculous transformation occurs in one’s mind through the state of Stream-entry—such a massive revolution and change occurs due to listening to this Dhamma.</w:t>
+        <w:t xml:space="preserve">In this manner, that there is no core here, that it cannot be maintained under one's control, must have been understood by that child named </w:t>
+      </w:r>
+      <w:proofErr w:type="spellStart"/>
+      <w:r>
+        <w:t>Kāla</w:t>
+      </w:r>
+      <w:proofErr w:type="spellEnd"/>
+      <w:r>
+        <w:t xml:space="preserve"> too, through his own subject of meditation—his meditation topic. What was the meditation? This bag of gold coins. Through the bag of gold coins itself, this child must have understood: "Now, other things are just like this too." It is said in this Dispensation that seven-year-old children attained </w:t>
+      </w:r>
+      <w:proofErr w:type="spellStart"/>
+      <w:r>
+        <w:t>Arahantship</w:t>
+      </w:r>
+      <w:proofErr w:type="spellEnd"/>
+      <w:r>
+        <w:t xml:space="preserve">. Not by reading books or possessing great scholarly cleverness or degrees. What happens? It is the change that occurs within the mind. This child reflects. If there is a power of merit, they understand a profound Dhamma through a small incident. This is what must have happened to </w:t>
+      </w:r>
+      <w:proofErr w:type="spellStart"/>
+      <w:r>
+        <w:t>Kāla</w:t>
+      </w:r>
+      <w:proofErr w:type="spellEnd"/>
+      <w:r>
+        <w:t xml:space="preserve"> too. Through this meditation on the bag of gold coins, because of the method, the </w:t>
+      </w:r>
+      <w:proofErr w:type="gramStart"/>
+      <w:r>
+        <w:t>manner in which</w:t>
+      </w:r>
+      <w:proofErr w:type="gramEnd"/>
+      <w:r>
+        <w:t xml:space="preserve"> the Blessed One preached the Dhamma, the things relevant to meditation must have gradually emerged for this child through that bag of gold coins.</w:t>
       </w:r>
     </w:p>
     <w:p>
       <w:r>
-        <w:t>This is how the Buddha has declared the fruit of Stream-entry. According to this declaration, sole sovereignty over the earth is something great that worldly beings desire, but why is this Stream-entry said to be greater than all of them? Even if one rules as sole monarch over the entire earth, one is still liable to fall into the lower realms due to the journey through *saṁsāra*. But the Stream-enterer will never fall into the lower realms. That is why the state of Stream-entry was declared to be more noble than sole sovereignty over the earth.</w:t>
+        <w:lastRenderedPageBreak/>
+        <w:t>A point mentioned in this Dhamma regarding meditators is that one must contemplate these things called Formations (*</w:t>
+      </w:r>
+      <w:proofErr w:type="spellStart"/>
+      <w:r>
+        <w:t>saṅkhāra</w:t>
+      </w:r>
+      <w:proofErr w:type="spellEnd"/>
+      <w:r>
+        <w:t>*) as Impermanent (*</w:t>
+      </w:r>
+      <w:proofErr w:type="spellStart"/>
+      <w:r>
+        <w:t>anicca</w:t>
+      </w:r>
+      <w:proofErr w:type="spellEnd"/>
+      <w:r>
+        <w:t>*), Suffering (*dukkha*), and Not-self (*</w:t>
+      </w:r>
+      <w:proofErr w:type="spellStart"/>
+      <w:r>
+        <w:t>anattā</w:t>
+      </w:r>
+      <w:proofErr w:type="spellEnd"/>
+      <w:r>
+        <w:t>*). When speaking of these Formations (*</w:t>
+      </w:r>
+      <w:proofErr w:type="spellStart"/>
+      <w:r>
+        <w:t>saṅkhāra</w:t>
+      </w:r>
+      <w:proofErr w:type="spellEnd"/>
+      <w:r>
+        <w:t>*)—even though we have given various names to all of these, the meditator reflects on them as Name-and-Form (*</w:t>
+      </w:r>
+      <w:proofErr w:type="spellStart"/>
+      <w:r>
+        <w:t>nāmarūpa</w:t>
+      </w:r>
+      <w:proofErr w:type="spellEnd"/>
+      <w:r>
+        <w:t>*). When we say Name-and-Form (*</w:t>
+      </w:r>
+      <w:proofErr w:type="spellStart"/>
+      <w:r>
+        <w:t>nāmarūpa</w:t>
+      </w:r>
+      <w:proofErr w:type="spellEnd"/>
+      <w:r>
+        <w:t>*), we can understand that here there is only a pile of names and a pile of forms. Even though we have placed names in the world calling them such-and-such things, when looking at them from within, when looking at them as they appear to the mind, the Blessed One has shown the phenomena present here in this way: here there is—Feeling (*</w:t>
+      </w:r>
+      <w:proofErr w:type="spellStart"/>
+      <w:r>
+        <w:t>vedanā</w:t>
+      </w:r>
+      <w:proofErr w:type="spellEnd"/>
+      <w:r>
+        <w:t>*)—there is something called Feeling (*</w:t>
+      </w:r>
+      <w:proofErr w:type="spellStart"/>
+      <w:r>
+        <w:t>vedanā</w:t>
+      </w:r>
+      <w:proofErr w:type="spellEnd"/>
+      <w:r>
+        <w:t>*), there is perception (*</w:t>
+      </w:r>
+      <w:proofErr w:type="spellStart"/>
+      <w:r>
+        <w:t>saññā</w:t>
+      </w:r>
+      <w:proofErr w:type="spellEnd"/>
+      <w:r>
+        <w:t>*), there is volition (*</w:t>
+      </w:r>
+      <w:proofErr w:type="spellStart"/>
+      <w:r>
+        <w:t>cetanā</w:t>
+      </w:r>
+      <w:proofErr w:type="spellEnd"/>
+      <w:r>
+        <w:t>*), there is Contact (*</w:t>
+      </w:r>
+      <w:proofErr w:type="spellStart"/>
+      <w:r>
+        <w:t>phassa</w:t>
+      </w:r>
+      <w:proofErr w:type="spellEnd"/>
+      <w:r>
+        <w:t>*), and there is attention (*</w:t>
+      </w:r>
+      <w:proofErr w:type="spellStart"/>
+      <w:r>
+        <w:t>manasikāra</w:t>
+      </w:r>
+      <w:proofErr w:type="spellEnd"/>
+      <w:r>
+        <w:t>*), which is reflection. Feeling (*</w:t>
+      </w:r>
+      <w:proofErr w:type="spellStart"/>
+      <w:r>
+        <w:t>vedanā</w:t>
+      </w:r>
+      <w:proofErr w:type="spellEnd"/>
+      <w:r>
+        <w:t>*), perception (*</w:t>
+      </w:r>
+      <w:proofErr w:type="spellStart"/>
+      <w:r>
+        <w:t>saññā</w:t>
+      </w:r>
+      <w:proofErr w:type="spellEnd"/>
+      <w:r>
+        <w:t>*), volition (*</w:t>
+      </w:r>
+      <w:proofErr w:type="spellStart"/>
+      <w:r>
+        <w:t>cetanā</w:t>
+      </w:r>
+      <w:proofErr w:type="spellEnd"/>
+      <w:r>
+        <w:t>*), Contact (*</w:t>
+      </w:r>
+      <w:proofErr w:type="spellStart"/>
+      <w:r>
+        <w:t>phassa</w:t>
+      </w:r>
+      <w:proofErr w:type="spellEnd"/>
+      <w:r>
+        <w:t>*), and attention (*</w:t>
+      </w:r>
+      <w:proofErr w:type="spellStart"/>
+      <w:r>
+        <w:t>manasikāra</w:t>
+      </w:r>
+      <w:proofErr w:type="spellEnd"/>
+      <w:r>
+        <w:t>*)—these five phenomena are introduced as mental phenomena (*</w:t>
+      </w:r>
+      <w:proofErr w:type="spellStart"/>
+      <w:r>
+        <w:t>nāma</w:t>
+      </w:r>
+      <w:proofErr w:type="spellEnd"/>
+      <w:r>
+        <w:t xml:space="preserve">*). Now, in the world, we have given names to various things like 'table' and 'chair'. Now we </w:t>
+      </w:r>
+      <w:proofErr w:type="gramStart"/>
+      <w:r>
+        <w:t>say</w:t>
+      </w:r>
+      <w:proofErr w:type="gramEnd"/>
+      <w:r>
+        <w:t xml:space="preserve"> 'gold coins' (*</w:t>
+      </w:r>
+      <w:proofErr w:type="spellStart"/>
+      <w:r>
+        <w:t>masuran</w:t>
+      </w:r>
+      <w:proofErr w:type="spellEnd"/>
+      <w:r>
+        <w:t>*). But here, it is not gold coins; rather, ultimately, this is all that is understood by the mind. When reflecting deeply, that child also must have understood: "Even though a name is given in the world, even though they say these are gold, what is present here inside this mind is only this much. There is some Feeling (*</w:t>
+      </w:r>
+      <w:proofErr w:type="spellStart"/>
+      <w:r>
+        <w:t>vedanā</w:t>
+      </w:r>
+      <w:proofErr w:type="spellEnd"/>
+      <w:r>
+        <w:t>*). Because of the hope of obtaining this, there is a pleasant Feeling (*</w:t>
+      </w:r>
+      <w:proofErr w:type="spellStart"/>
+      <w:r>
+        <w:t>sukha-vedanā</w:t>
+      </w:r>
+      <w:proofErr w:type="spellEnd"/>
+      <w:r>
+        <w:t xml:space="preserve">*). Correspondingly, there is a certain </w:t>
+      </w:r>
+      <w:proofErr w:type="gramStart"/>
+      <w:r>
+        <w:t>perception—that gold,</w:t>
+      </w:r>
+      <w:proofErr w:type="gramEnd"/>
+      <w:r>
+        <w:t xml:space="preserve"> that gold coins are something very valuable. There is a volition—a hope—to obtain them: that thought. When that word of Dhamma is heard, there is a certain impact, a Contact (*</w:t>
+      </w:r>
+      <w:proofErr w:type="spellStart"/>
+      <w:r>
+        <w:t>phassa</w:t>
+      </w:r>
+      <w:proofErr w:type="spellEnd"/>
+      <w:r>
+        <w:t>*) in the mind. According to that Contact (*</w:t>
+      </w:r>
+      <w:proofErr w:type="spellStart"/>
+      <w:r>
+        <w:t>phassa</w:t>
+      </w:r>
+      <w:proofErr w:type="spellEnd"/>
+      <w:r>
+        <w:t>*), there is attention—the mind directing itself towards it. Only this much occurs inside the mind." Thus, while the Blessed One was preaching the Dhamma in this way, that child understood, with every word of Dhamma spoken: "This is all that is happening in my mind. There is no gold coin received. There is nothing valuable or extraordinary here. This is all there is." That is the understanding of mental phenomena (*</w:t>
+      </w:r>
+      <w:proofErr w:type="spellStart"/>
+      <w:r>
+        <w:t>nāma</w:t>
+      </w:r>
+      <w:proofErr w:type="spellEnd"/>
+      <w:r>
+        <w:t>-dhamma*).</w:t>
       </w:r>
     </w:p>
     <w:p>
       <w:r>
-        <w:t>The Buddha has demonstrated the supreme value of this fruit of Stream-entry on other occasions as well. On one occasion, He took a little soil on the tip of His fingernail and asked the Sangha: "Monks, which is greater, the little soil on this fingernail or the soil of the great earth?" To that, the monks declared: "Venerable Sir, Blessed One, the soil on your fingernail is very little. The soil of the great earth is far greater." Following that simile, the Buddha declared: "Even so, monks, the amount of suffering (*dukkha*) that has been ended and freed from in this near *saṁsāra* is like the soil of the great earth, and the amount of suffering that is left—the remaining suffering to be spent—is like the soil on this fingernail, very little, extremely minuscule." Such a great freedom does the Stream-enterer</w:t>
-      </w:r>
-      <w:r>
-        <w:t xml:space="preserve"> </w:t>
-      </w:r>
-      <w:r>
-        <w:t>obtain. This fruit of Stream-entry is the first of the supramundane realizations. There are four paths and fruits (*magga-phala*) in this Buddha-dispensation: Stream-entry (*Sotāpatti*), Once-returning (*Sakadāgāmī*), Non-returning (*Anāgāmī*), and Arahantship (*Arahatta*). Among them, the first is the fruit of Stream-entry. They grow progressively stronger, and ultimately at the fruit of Arahantship—one is completely unburdened by the supreme *</w:t>
-      </w:r>
-      <w:r>
-        <w:t>Nibbāna</w:t>
-      </w:r>
-      <w:r>
-        <w:t xml:space="preserve"> and puts an end to the suffering of *saṁsāra*. Therefore, the Buddha declared that even the fruit of Stream-entry is such a noble thing.</w:t>
+        <w:t>Next, what are called physical phenomena (*</w:t>
+      </w:r>
+      <w:proofErr w:type="spellStart"/>
+      <w:r>
+        <w:t>rūpa</w:t>
+      </w:r>
+      <w:proofErr w:type="spellEnd"/>
+      <w:r>
+        <w:t>-dhamma*)—even though all the things present in the world are decorated with various colors and have shapes and sizes, all of these are constructed and made of the four great elements, which are introduced in the Dhamma as earth (*</w:t>
+      </w:r>
+      <w:proofErr w:type="spellStart"/>
+      <w:r>
+        <w:t>paṭhavī</w:t>
+      </w:r>
+      <w:proofErr w:type="spellEnd"/>
+      <w:r>
+        <w:t>*), water (*</w:t>
+      </w:r>
+      <w:proofErr w:type="spellStart"/>
+      <w:r>
+        <w:t>āpo</w:t>
+      </w:r>
+      <w:proofErr w:type="spellEnd"/>
+      <w:r>
+        <w:t>*), fire (*</w:t>
+      </w:r>
+      <w:proofErr w:type="spellStart"/>
+      <w:r>
+        <w:t>tejo</w:t>
+      </w:r>
+      <w:proofErr w:type="spellEnd"/>
+      <w:r>
+        <w:t>*), and wind (*</w:t>
+      </w:r>
+      <w:proofErr w:type="spellStart"/>
+      <w:r>
+        <w:t>vāyo</w:t>
+      </w:r>
+      <w:proofErr w:type="spellEnd"/>
+      <w:r>
+        <w:t>*). Earth (*</w:t>
+      </w:r>
+      <w:proofErr w:type="spellStart"/>
+      <w:r>
+        <w:t>paṭhavī</w:t>
+      </w:r>
+      <w:proofErr w:type="spellEnd"/>
+      <w:r>
+        <w:t>*) is the element of hardness present in this great earth, in trees, rocks, and so on. Likewise, water (*</w:t>
+      </w:r>
+      <w:proofErr w:type="spellStart"/>
+      <w:r>
+        <w:t>āpo</w:t>
+      </w:r>
+      <w:proofErr w:type="spellEnd"/>
+      <w:r>
+        <w:t>*)—it is raining at this moment—is the water element. We recognize the water element in relation to the great ocean and water reservoirs. Likewise, the fire element (*</w:t>
+      </w:r>
+      <w:proofErr w:type="spellStart"/>
+      <w:r>
+        <w:t>tejo-dhātu</w:t>
+      </w:r>
+      <w:proofErr w:type="spellEnd"/>
+      <w:r>
+        <w:t>*)—warmth; the wind element (*</w:t>
+      </w:r>
+      <w:proofErr w:type="spellStart"/>
+      <w:r>
+        <w:t>vāyo-dhātu</w:t>
+      </w:r>
+      <w:proofErr w:type="spellEnd"/>
+      <w:r>
+        <w:t xml:space="preserve">*)—air. In this way, this body of ours and other things are things constructed by earth, water, fire, and wind. This is all there is to it. Even if we call it </w:t>
+      </w:r>
+      <w:proofErr w:type="spellStart"/>
+      <w:r>
+        <w:t>kahāpaṇas</w:t>
+      </w:r>
+      <w:proofErr w:type="spellEnd"/>
+      <w:r>
+        <w:t xml:space="preserve"> or gold, whether it is melted, whether it is red gold or raw gold, in all of these, there are only these four elements. When reflecting on everything in this way, one recognizes: "Here there is only a pile of Feelings (*</w:t>
+      </w:r>
+      <w:proofErr w:type="spellStart"/>
+      <w:r>
+        <w:t>vedanā</w:t>
+      </w:r>
+      <w:proofErr w:type="spellEnd"/>
+      <w:r>
+        <w:t>*), a pile of perceptions (*</w:t>
+      </w:r>
+      <w:proofErr w:type="spellStart"/>
+      <w:r>
+        <w:t>saññā</w:t>
+      </w:r>
+      <w:proofErr w:type="spellEnd"/>
+      <w:r>
+        <w:t>*), a pile of volitions—a pile of thoughts and expectations—a Contact (*</w:t>
+      </w:r>
+      <w:proofErr w:type="spellStart"/>
+      <w:r>
+        <w:t>phassa</w:t>
+      </w:r>
+      <w:proofErr w:type="spellEnd"/>
+      <w:r>
+        <w:t xml:space="preserve">*), and a reflection by the mind." Next, regarding all other things in the </w:t>
+      </w:r>
+      <w:proofErr w:type="gramStart"/>
+      <w:r>
+        <w:t>world—</w:t>
+      </w:r>
+      <w:proofErr w:type="gramEnd"/>
+      <w:r>
+        <w:t xml:space="preserve">valuable or </w:t>
+      </w:r>
+      <w:proofErr w:type="gramStart"/>
+      <w:r>
+        <w:t>worthless—</w:t>
+      </w:r>
+      <w:proofErr w:type="gramEnd"/>
+      <w:r>
+        <w:t xml:space="preserve">there are no such stories. It is through the realization that </w:t>
+      </w:r>
+      <w:r>
+        <w:lastRenderedPageBreak/>
+        <w:t>"within everything, there are only these four elements" that one can attain deep states in this Dhamma. This is called contemplating them as Name-and-Form (*</w:t>
+      </w:r>
+      <w:proofErr w:type="spellStart"/>
+      <w:r>
+        <w:t>nāmarūpa</w:t>
+      </w:r>
+      <w:proofErr w:type="spellEnd"/>
+      <w:r>
+        <w:t xml:space="preserve">*). Perhaps, in that way, </w:t>
+      </w:r>
+      <w:proofErr w:type="spellStart"/>
+      <w:r>
+        <w:t>Kāla's</w:t>
+      </w:r>
+      <w:proofErr w:type="spellEnd"/>
+      <w:r>
+        <w:t xml:space="preserve"> warm expectations regarding the bag of gold coins vanished: "This is a futile task." Next, when looking: "What am I doing? While listening to the Dhamma of the Blessed One, I am thinking about these bags of gold coins." Then, gradually, </w:t>
+      </w:r>
+      <w:proofErr w:type="spellStart"/>
+      <w:r>
+        <w:t>Kāla's</w:t>
+      </w:r>
+      <w:proofErr w:type="spellEnd"/>
+      <w:r>
+        <w:t xml:space="preserve"> desire for that gold disappeared. A weariness, a disillusionment towards these arose. Indeed, what helps one to obtain these supramundane states is disillusionment with </w:t>
+      </w:r>
+      <w:proofErr w:type="spellStart"/>
+      <w:r>
+        <w:t>saṁsāra</w:t>
+      </w:r>
+      <w:proofErr w:type="spellEnd"/>
+      <w:r>
+        <w:t xml:space="preserve">. It is mentioned in the Dhamma regarding some who obtained these noble states—like </w:t>
+      </w:r>
+      <w:proofErr w:type="spellStart"/>
+      <w:r>
+        <w:t>Paṭācārā</w:t>
+      </w:r>
+      <w:proofErr w:type="spellEnd"/>
+      <w:r>
+        <w:t xml:space="preserve">, </w:t>
+      </w:r>
+      <w:proofErr w:type="spellStart"/>
+      <w:r>
+        <w:t>Kisāgotamī</w:t>
+      </w:r>
+      <w:proofErr w:type="spellEnd"/>
+      <w:r>
+        <w:t xml:space="preserve">, and others—that when some terrible disaster occurred in their lives, they then reflected, "This is the nature of the world." Similarly, now, because of this matter, </w:t>
+      </w:r>
+      <w:proofErr w:type="spellStart"/>
+      <w:r>
+        <w:t>Kāla</w:t>
+      </w:r>
+      <w:proofErr w:type="spellEnd"/>
+      <w:r>
+        <w:t xml:space="preserve"> too understood that these are futile tasks. Understanding this Impermanence (*</w:t>
+      </w:r>
+      <w:proofErr w:type="spellStart"/>
+      <w:r>
+        <w:t>aniccata</w:t>
+      </w:r>
+      <w:proofErr w:type="spellEnd"/>
+      <w:r>
+        <w:t>*), the nature of Suffering (*dukkha*), and the nature of Not-self (*</w:t>
+      </w:r>
+      <w:proofErr w:type="spellStart"/>
+      <w:r>
+        <w:t>anattā</w:t>
+      </w:r>
+      <w:proofErr w:type="spellEnd"/>
+      <w:r>
+        <w:t>*), he abandoned his desires for the bag of gold coins.</w:t>
       </w:r>
     </w:p>
     <w:p>
       <w:r>
-        <w:t>Now, you might also wonder: how did this child of old acquire such a great thing? How does one obtain such a noble supramundane state? One might think: how did a child who previously did not attend on the Sangha, and did not even want to see the Buddha, obtain such a supramundane state just by listening to a single Dhamma sermon of the Buddha? This is an occasion worthy of deep reflection. Generally, such a great state is achieved by meditating continuously, by a person who works righteously to attain that state. We might wonder how this child was able to do so. But, pious friends, there is no *</w:t>
-      </w:r>
-      <w:r>
-        <w:t>Nibbāna</w:t>
-      </w:r>
-      <w:r>
-        <w:t xml:space="preserve"> without meditation (*bhāvanā*). Now let us investigate a little what kind of meditation was present within this child.</w:t>
+        <w:t>When he abandoned that desire, then he began to grasp the word of Dhamma preached by the Blessed One. Virtuous friends, there is a great miracle, a great wonder in this Dhamma of the Blessed One. What is it? "The more you try to grasp this Dhamma, the more it slips away; the more you let go, the more it is grasped." Now, this child was trying to grasp the Dhamma; he hoped to grasp a word of Dhamma, go home, and get that gold. But when he tried to 'grasp' the word of Dhamma, the Dhamma slipped away. Now, as he let this go—as he let go of the desire for the gold—then he began to grasp the word of Dhamma. From this, we can understand that what helps us to understand this entire Dhamma is letting go. What is done through all things, such as giving alms (*dāna*) and keeping precepts (*</w:t>
+      </w:r>
+      <w:proofErr w:type="spellStart"/>
+      <w:r>
+        <w:t>sīla</w:t>
+      </w:r>
+      <w:proofErr w:type="spellEnd"/>
+      <w:r>
+        <w:t xml:space="preserve">*), is letting go. As you let go and let go, the Dhamma is grasped. That is what ultimately, through such a great revolution of the mind, contributed to </w:t>
+      </w:r>
+      <w:proofErr w:type="spellStart"/>
+      <w:r>
+        <w:t>Kāla</w:t>
+      </w:r>
+      <w:proofErr w:type="spellEnd"/>
+      <w:r>
+        <w:t xml:space="preserve"> obtaining such a supramundane state—the state of Stream-entry. He might also be someone who had practiced meditation in past </w:t>
+      </w:r>
+      <w:proofErr w:type="gramStart"/>
+      <w:r>
+        <w:t>lives</w:t>
+      </w:r>
+      <w:proofErr w:type="gramEnd"/>
+      <w:r>
+        <w:t>. Even though he lived in that manner during the early part of this life due to some unfortunate cause, we can understand that through the Blessed One's skillful strategy, those insight-knowledges (*</w:t>
+      </w:r>
+      <w:proofErr w:type="spellStart"/>
+      <w:r>
+        <w:t>vipassanā-ñāṇa</w:t>
+      </w:r>
+      <w:proofErr w:type="spellEnd"/>
+      <w:r>
+        <w:t>*) emerged within this child, and he obtained the noble fruit of Stream-entry (*</w:t>
+      </w:r>
+      <w:proofErr w:type="spellStart"/>
+      <w:r>
+        <w:t>Sotāpatti-phala</w:t>
+      </w:r>
+      <w:proofErr w:type="spellEnd"/>
+      <w:r>
+        <w:t>*).</w:t>
       </w:r>
     </w:p>
     <w:p>
       <w:r>
-        <w:t xml:space="preserve">From the details of this story, we can understand, through certain hints therein, what kind of meditation was in this child's mind. There are Three Characteristics that the Buddha declared regarding everything that exists in this world and this life. Everything is </w:t>
-      </w:r>
-      <w:r>
-        <w:t>*Anicca* (Impermanent)</w:t>
-      </w:r>
-      <w:r>
-        <w:t xml:space="preserve">. In the final analysis, everything is </w:t>
-      </w:r>
-      <w:r>
-        <w:t>*Dukkha* (Suffering)</w:t>
-      </w:r>
-      <w:r>
-        <w:t xml:space="preserve">. Likewise, because there is no lasting, individual essence fit to be taken as "I" or "mine", everything is </w:t>
-      </w:r>
-      <w:r>
-        <w:t>*Anattā* (Not-self)</w:t>
-      </w:r>
-      <w:r>
-        <w:t>. These Three Characteristics, which are the signs of the entire world, do not become apparent to others' understanding—they are not apparent to ordinary worldly people. It is to the deep insight-wisdom (*vipassanā-ñāṇa*) that goes deep into the subject that this becomes clear. How, then, did this child gain this understanding? Generally, it is by practicing the method known as meditation that this is received. What, then, was Kāla's method of meditation?</w:t>
+        <w:t xml:space="preserve">Now, from this story, we can bring out several very valuable points. Firstly, when reflecting on the strategy used by the treasurer </w:t>
+      </w:r>
+      <w:proofErr w:type="spellStart"/>
+      <w:r>
+        <w:t>Anāthapiṇḍika</w:t>
+      </w:r>
+      <w:proofErr w:type="spellEnd"/>
+      <w:r>
+        <w:t xml:space="preserve">, it is a good example for parents of this era too. On </w:t>
+      </w:r>
+      <w:proofErr w:type="gramStart"/>
+      <w:r>
+        <w:t>a Poya</w:t>
+      </w:r>
+      <w:proofErr w:type="gramEnd"/>
+      <w:r>
+        <w:t xml:space="preserve"> day, he used a certain strategy to bring his child closer to the Triple Gem. Indeed, the inheritance one must give to one's children is the inheritance of faith (*</w:t>
+      </w:r>
+      <w:proofErr w:type="spellStart"/>
+      <w:r>
+        <w:t>saddhā</w:t>
+      </w:r>
+      <w:proofErr w:type="spellEnd"/>
+      <w:r>
+        <w:t xml:space="preserve">*) and the inheritance of Dhamma. In that way, the treasurer </w:t>
+      </w:r>
+      <w:proofErr w:type="spellStart"/>
+      <w:r>
+        <w:t>Anāthapiṇḍika</w:t>
+      </w:r>
+      <w:proofErr w:type="spellEnd"/>
+      <w:r>
+        <w:t xml:space="preserve"> tried to bring his child close to the Triple Gem, even by putting money on the line—by giving a promise of money. That is also a good example.</w:t>
       </w:r>
     </w:p>
     <w:p>
       <w:r>
-        <w:t>Kāla's meditation subject (*kammaṭṭhāna*) was the statement of the great treasurer Anāthapiṇḍika: "If you learn a verse of Dhamma and return, I will give you a thousand gold coins."</w:t>
+        <w:t xml:space="preserve">Likewise, there is also an example here that we can take into our lives. What is it? We can extract </w:t>
+      </w:r>
+      <w:proofErr w:type="spellStart"/>
+      <w:r>
+        <w:t>Nibbāna</w:t>
+      </w:r>
+      <w:proofErr w:type="spellEnd"/>
+      <w:r>
+        <w:t xml:space="preserve"> from the very life problems presented to us. The problem present before </w:t>
+      </w:r>
+      <w:proofErr w:type="spellStart"/>
+      <w:r>
+        <w:t>Kāla's</w:t>
+      </w:r>
+      <w:proofErr w:type="spellEnd"/>
+      <w:r>
+        <w:t xml:space="preserve"> life was to somehow grasp a word of Dhamma and obtain that gold. Through that very problem, that child extracted </w:t>
+      </w:r>
+      <w:proofErr w:type="spellStart"/>
+      <w:r>
+        <w:t>Nibbāna</w:t>
+      </w:r>
+      <w:proofErr w:type="spellEnd"/>
+      <w:r>
+        <w:t xml:space="preserve">. To do that, some transformation must occur within the mind. Life problems exist for </w:t>
+      </w:r>
+      <w:proofErr w:type="gramStart"/>
+      <w:r>
+        <w:t>everyone—for</w:t>
+      </w:r>
+      <w:proofErr w:type="gramEnd"/>
+      <w:r>
+        <w:t xml:space="preserve"> every person. They face various </w:t>
+      </w:r>
+      <w:r>
+        <w:lastRenderedPageBreak/>
+        <w:t xml:space="preserve">disasters and adversities. But the world does not know how to obtain those noble states through them. For that, some special transformation must occur. Firstly, a change must occur in the way we look at the world. That is called attitude. The Blessed One has shown that way of looking. How does the ordinary </w:t>
+      </w:r>
+      <w:proofErr w:type="gramStart"/>
+      <w:r>
+        <w:t>worldly person</w:t>
+      </w:r>
+      <w:proofErr w:type="gramEnd"/>
+      <w:r>
+        <w:t xml:space="preserve"> look at the world? "</w:t>
+      </w:r>
+      <w:proofErr w:type="spellStart"/>
+      <w:r>
+        <w:t>Anicce</w:t>
+      </w:r>
+      <w:proofErr w:type="spellEnd"/>
+      <w:r>
+        <w:t xml:space="preserve"> </w:t>
+      </w:r>
+      <w:proofErr w:type="spellStart"/>
+      <w:r>
+        <w:t>nicca-saññā</w:t>
+      </w:r>
+      <w:proofErr w:type="spellEnd"/>
+      <w:r>
+        <w:t>"—there is a nature in the world of considering the impermanent as permanent, of recognizing the impermanent as permanent. Likewise, "</w:t>
+      </w:r>
+      <w:proofErr w:type="spellStart"/>
+      <w:r>
+        <w:t>Dukkhe</w:t>
+      </w:r>
+      <w:proofErr w:type="spellEnd"/>
+      <w:r>
+        <w:t xml:space="preserve"> </w:t>
+      </w:r>
+      <w:proofErr w:type="spellStart"/>
+      <w:r>
+        <w:t>sukha-saññā</w:t>
+      </w:r>
+      <w:proofErr w:type="spellEnd"/>
+      <w:r>
+        <w:t>"—thinking that what is full of Suffering (*dukkha*) is pleasure—such an understanding, such a feeling exists in the world. "</w:t>
+      </w:r>
+      <w:proofErr w:type="spellStart"/>
+      <w:r>
+        <w:t>Asubhe</w:t>
+      </w:r>
+      <w:proofErr w:type="spellEnd"/>
+      <w:r>
+        <w:t xml:space="preserve"> subha-</w:t>
+      </w:r>
+      <w:proofErr w:type="spellStart"/>
+      <w:proofErr w:type="gramStart"/>
+      <w:r>
+        <w:t>saññā</w:t>
+      </w:r>
+      <w:proofErr w:type="spellEnd"/>
+      <w:r>
+        <w:t>"—</w:t>
+      </w:r>
+      <w:proofErr w:type="gramEnd"/>
+      <w:r>
+        <w:t>that is, even though there is nothing that can be taken as beautiful, or as good and pure, they appear as beautiful. Likewise, "</w:t>
+      </w:r>
+      <w:proofErr w:type="spellStart"/>
+      <w:r>
+        <w:t>Anatte</w:t>
+      </w:r>
+      <w:proofErr w:type="spellEnd"/>
+      <w:r>
+        <w:t xml:space="preserve"> atta-</w:t>
+      </w:r>
+      <w:proofErr w:type="spellStart"/>
+      <w:proofErr w:type="gramStart"/>
+      <w:r>
+        <w:t>saññā</w:t>
+      </w:r>
+      <w:proofErr w:type="spellEnd"/>
+      <w:r>
+        <w:t>"—</w:t>
+      </w:r>
+      <w:proofErr w:type="gramEnd"/>
+      <w:r>
+        <w:t>even what cannot be taken as self, as "myself" or "mine," is taken as "myself" and "mine." The Blessed One declared that there are four such wrong understandings in the world. They are called the "perversions of perception" (*</w:t>
+      </w:r>
+      <w:proofErr w:type="spellStart"/>
+      <w:r>
+        <w:t>vipallāsa</w:t>
+      </w:r>
+      <w:proofErr w:type="spellEnd"/>
+      <w:r>
+        <w:t>-dhamma*)—distorted ideas. Distorted ideas mean entirely wrong ideas, as if turned upside down. Therefore, in place of that, what Buddhists must do is always strive to develop that correct attitude. How is that correct way? One must practice contemplating the impermanent as Impermanent (*</w:t>
+      </w:r>
+      <w:proofErr w:type="spellStart"/>
+      <w:r>
+        <w:t>anicca</w:t>
+      </w:r>
+      <w:proofErr w:type="spellEnd"/>
+      <w:r>
+        <w:t>*). One must practice contemplating the foul as foul. One must train the mind to think that what is Not-self (*</w:t>
+      </w:r>
+      <w:proofErr w:type="spellStart"/>
+      <w:r>
+        <w:t>anattā</w:t>
+      </w:r>
+      <w:proofErr w:type="spellEnd"/>
+      <w:r>
+        <w:t>*)—what cannot be taken as "myself" or "mine"—is not mine.</w:t>
       </w:r>
     </w:p>
     <w:p>
       <w:r>
-        <w:t xml:space="preserve">Then, before this child went to the monastery, he held that bag of gold coins in his mind, with the idea: "I will listen to a verse of Dhamma somehow and obtain this gold," and prepared himself to listen to the Dhamma, with his mind focused on that. But how did the Buddha clean and purify this meditation subject (*kammaṭṭhāna*) and bring it close to him? Knowing this matter, the Buddha began to preach the Dhamma in such a way that he could not grasp even a single word of the Dhamma. To this child, what the Buddha was declaring appeared like a bag of gold coins. If a child has a desire for some object, at that time, it is that object which appears to him. Similarly, due to his desire for the bag of gold coins, when he sat in front of the Buddha and listened to the Dhamma, every Dhamma phrase appeared to him like a bag of gold coins. So, he tries to grasp the first key bag, and simultaneously it slips away from him like a coin. He grasps the next one. "Alas, that is gone." He grasps the next. Thinking in this manner, phrase by phrase, the child gave his consent to the Dhamma preached by the Buddha. At that moment, as he went a long way, when each bag of gold coins slipped away, it occurred to the child: "I cannot grasp it"—all of this is passing away, therefore everything is </w:t>
-      </w:r>
-      <w:r>
-        <w:t>*Anicca* (Impermanent)</w:t>
-      </w:r>
-      <w:r>
-        <w:t>, not even one can be grasped—"it comes and goes" in this very unstable manner, and only the fact of its ending remains in his memory.</w:t>
+        <w:t xml:space="preserve">Now, that is exactly what happened within that child. While listening to the Dhamma, he first thought this was a permanent thing, a pleasant thing; thinking in that way, he began to listen to the Dhamma with a great desire and expectation for that bag of gold coins. But later, due to </w:t>
+      </w:r>
+      <w:proofErr w:type="gramStart"/>
+      <w:r>
+        <w:t>the Blessed</w:t>
+      </w:r>
+      <w:proofErr w:type="gramEnd"/>
+      <w:r>
+        <w:t xml:space="preserve"> One's strategy, that understanding gradually came: "There is nothing to be taken here. This is Impermanent (*</w:t>
+      </w:r>
+      <w:proofErr w:type="spellStart"/>
+      <w:r>
+        <w:t>anicca</w:t>
+      </w:r>
+      <w:proofErr w:type="spellEnd"/>
+      <w:r>
+        <w:t>*), full of Suffering (*dukkha*), there is nothing beautiful. There is nothing here to be taken as mine." Thus, a change occurred in the way he looked at the world. Next, something similar—</w:t>
+      </w:r>
+      <w:proofErr w:type="gramStart"/>
+      <w:r>
+        <w:t>in order to</w:t>
+      </w:r>
+      <w:proofErr w:type="gramEnd"/>
+      <w:r>
+        <w:t xml:space="preserve"> extract </w:t>
+      </w:r>
+      <w:proofErr w:type="gramStart"/>
+      <w:r>
+        <w:t>the Dhamma</w:t>
+      </w:r>
+      <w:proofErr w:type="gramEnd"/>
+      <w:r>
+        <w:t xml:space="preserve"> from our life problems—is what is called reflection. We direct our mind to all these things and try to obtain an understanding of </w:t>
+      </w:r>
+      <w:proofErr w:type="gramStart"/>
+      <w:r>
+        <w:t>them—</w:t>
+      </w:r>
+      <w:proofErr w:type="gramEnd"/>
+      <w:r>
+        <w:t>reflection. This reflection too is often done in a wrong way in the world. The Blessed One refers to this as unwise attention (*</w:t>
+      </w:r>
+      <w:proofErr w:type="spellStart"/>
+      <w:r>
+        <w:t>ayoniso</w:t>
+      </w:r>
+      <w:proofErr w:type="spellEnd"/>
+      <w:r>
+        <w:t xml:space="preserve"> </w:t>
+      </w:r>
+      <w:proofErr w:type="spellStart"/>
+      <w:r>
+        <w:t>manasikāra</w:t>
+      </w:r>
+      <w:proofErr w:type="spellEnd"/>
+      <w:r>
+        <w:t>*). Unwise attention (*</w:t>
+      </w:r>
+      <w:proofErr w:type="spellStart"/>
+      <w:r>
+        <w:t>ayoniso</w:t>
+      </w:r>
+      <w:proofErr w:type="spellEnd"/>
+      <w:r>
+        <w:t xml:space="preserve"> </w:t>
+      </w:r>
+      <w:proofErr w:type="spellStart"/>
+      <w:r>
+        <w:t>manasikāra</w:t>
+      </w:r>
+      <w:proofErr w:type="spellEnd"/>
+      <w:r>
+        <w:t xml:space="preserve">*), if we express it in a commonly understood word, is improper reflection, improper—or inappropriate—reflecting in a way that is not correct. The illustration for that is: here, when the Blessed One was preaching the Dhamma, this child first began to reflect on the word of Dhamma keeping the bag of gold coins in mind. In the depths of his </w:t>
+      </w:r>
+      <w:proofErr w:type="gramStart"/>
+      <w:r>
+        <w:t>mind—at</w:t>
+      </w:r>
+      <w:proofErr w:type="gramEnd"/>
+      <w:r>
+        <w:t xml:space="preserve"> the back of his mind—is the thought of the bag of gold coins. When reflecting on the word of Dhamma with the intention of obtaining the bag of gold coins in this way, the word of Dhamma is not caught correctly. That is wrong reflection. Most people in the world reflect in </w:t>
+      </w:r>
+      <w:proofErr w:type="gramStart"/>
+      <w:r>
+        <w:t>a wrong</w:t>
+      </w:r>
+      <w:proofErr w:type="gramEnd"/>
+      <w:r>
+        <w:t xml:space="preserve"> way when they reflect on various things. But proper reflection is </w:t>
+      </w:r>
+      <w:proofErr w:type="gramStart"/>
+      <w:r>
+        <w:t>Wise</w:t>
+      </w:r>
+      <w:proofErr w:type="gramEnd"/>
+      <w:r>
+        <w:t xml:space="preserve"> attention (*</w:t>
+      </w:r>
+      <w:proofErr w:type="spellStart"/>
+      <w:r>
+        <w:t>yoniso</w:t>
+      </w:r>
+      <w:proofErr w:type="spellEnd"/>
+      <w:r>
+        <w:t xml:space="preserve"> </w:t>
+      </w:r>
+      <w:proofErr w:type="spellStart"/>
+      <w:r>
+        <w:t>manasikāra</w:t>
+      </w:r>
+      <w:proofErr w:type="spellEnd"/>
+      <w:r>
+        <w:t>*). Thinking that all of these are things that arise from within, that "here there is only a pile of Feeling (*</w:t>
+      </w:r>
+      <w:proofErr w:type="spellStart"/>
+      <w:r>
+        <w:t>vedanā</w:t>
+      </w:r>
+      <w:proofErr w:type="spellEnd"/>
+      <w:r>
+        <w:t xml:space="preserve">*) experiences, a pile of perceptions, a pile of expectations, a pile of impacts, a pile of reflections"—that "here there is only earth, water, fire, and wind, which are these four elements." In this way, </w:t>
+      </w:r>
+      <w:proofErr w:type="gramStart"/>
+      <w:r>
+        <w:t>reflecting</w:t>
+      </w:r>
+      <w:proofErr w:type="gramEnd"/>
+      <w:r>
+        <w:t xml:space="preserve"> on their true nature, on things as they really are. That is what needs to be developed. This reflection, gradually developed, helps one to realize </w:t>
+      </w:r>
+      <w:proofErr w:type="spellStart"/>
+      <w:r>
+        <w:lastRenderedPageBreak/>
+        <w:t>Nibbāna</w:t>
+      </w:r>
+      <w:proofErr w:type="spellEnd"/>
+      <w:r>
+        <w:t>. We must abandon our wrong reflection and practice reflecting in the correct manner.</w:t>
       </w:r>
     </w:p>
     <w:p>
       <w:r>
-        <w:t xml:space="preserve">Then, you now hear hints of this, "in the street in front of my village, or sometimes at funerals", "it is written: *sabbe saṅkhārā aniccā*"—there is such a Dhamma phrase, what is its meaning? "*Sabbe saṅkhārā aniccā*"—"all preparations / formations / volitional activities are impermanent". "*Sabbe saṅkhārā*"—all things of the category of </w:t>
-      </w:r>
-      <w:r>
-        <w:t>*Saṅkhāra* (Formations)</w:t>
-      </w:r>
-      <w:r>
-        <w:t xml:space="preserve"> are impermanent. What is meant by *saṅkhāra*? In our colloquial language, it is "preparing", "making", or "fashioning". Let us think about "getting ready".</w:t>
+        <w:t xml:space="preserve">Likewise, there is another </w:t>
+      </w:r>
+      <w:proofErr w:type="gramStart"/>
+      <w:r>
+        <w:t>thing—something</w:t>
+      </w:r>
+      <w:proofErr w:type="gramEnd"/>
+      <w:r>
+        <w:t xml:space="preserve"> connected to this very reflection. Generally, when people of the world reflect on various things, they try to grasp them tightly—this is called misapprehension (*</w:t>
+      </w:r>
+      <w:proofErr w:type="spellStart"/>
+      <w:r>
+        <w:t>parāmāsa</w:t>
+      </w:r>
+      <w:proofErr w:type="spellEnd"/>
+      <w:r>
+        <w:t xml:space="preserve">*). During the time of the Blessed One, there were also some people who believed that by living as cattle, by keeping precepts in that way, they could realize </w:t>
+      </w:r>
+      <w:proofErr w:type="spellStart"/>
+      <w:r>
+        <w:t>Nibbāna</w:t>
+      </w:r>
+      <w:proofErr w:type="spellEnd"/>
+      <w:r>
+        <w:t xml:space="preserve">, or escape from </w:t>
+      </w:r>
+      <w:proofErr w:type="spellStart"/>
+      <w:r>
+        <w:t>saṁsāra</w:t>
+      </w:r>
+      <w:proofErr w:type="spellEnd"/>
+      <w:r>
+        <w:t>. This is called misapprehension (*</w:t>
+      </w:r>
+      <w:proofErr w:type="spellStart"/>
+      <w:r>
+        <w:t>parāmāsa</w:t>
+      </w:r>
+      <w:proofErr w:type="spellEnd"/>
+      <w:r>
+        <w:t>*). But in this Dhamma, the correct way of directing the mind to various things is shown as comprehension (*</w:t>
+      </w:r>
+      <w:proofErr w:type="spellStart"/>
+      <w:r>
+        <w:t>sammasana</w:t>
+      </w:r>
+      <w:proofErr w:type="spellEnd"/>
+      <w:r>
+        <w:t>*). In meditation, that reflection is done by the mind—like "touching" with the mind, like "feeling" with the mind. To understand this, let us return to the simile of the banana trunk. That person mentioned earlier—the person who saw the banana trunk for the first time—carried the banana tree on his shoulder, embracing it, thinking, "There is a core in this." This embracing, grasping in this way, is called misapprehension (*</w:t>
+      </w:r>
+      <w:proofErr w:type="spellStart"/>
+      <w:r>
+        <w:t>parāmāsa</w:t>
+      </w:r>
+      <w:proofErr w:type="spellEnd"/>
+      <w:r>
+        <w:t xml:space="preserve">*). Doing it in that way, one can never see </w:t>
+      </w:r>
+      <w:proofErr w:type="spellStart"/>
+      <w:r>
+        <w:t>Nibbāna</w:t>
+      </w:r>
+      <w:proofErr w:type="spellEnd"/>
+      <w:r>
+        <w:t>. One cannot be freed from this Suffering (*dukkha*). What is there to do instead? It is when, after peeling off one sheath of that banana trunk, one feels it subtly, that one finds there is a next sheath. Grasping one sheath, next one feels gently. As that sheath ends, another sheath, and beneath that, another sheath. In this way, one feels subtly. This is comprehension (*</w:t>
+      </w:r>
+      <w:proofErr w:type="spellStart"/>
+      <w:r>
+        <w:t>sammasana</w:t>
+      </w:r>
+      <w:proofErr w:type="spellEnd"/>
+      <w:r>
+        <w:t xml:space="preserve">*). This is not </w:t>
+      </w:r>
+      <w:proofErr w:type="gramStart"/>
+      <w:r>
+        <w:t>physical</w:t>
+      </w:r>
+      <w:proofErr w:type="gramEnd"/>
+      <w:r>
+        <w:t xml:space="preserve"> touching, but rather, what the meditator does is </w:t>
+      </w:r>
+      <w:proofErr w:type="gramStart"/>
+      <w:r>
+        <w:t>touching</w:t>
+      </w:r>
+      <w:proofErr w:type="gramEnd"/>
+      <w:r>
+        <w:t xml:space="preserve"> with the mind, </w:t>
+      </w:r>
+      <w:proofErr w:type="gramStart"/>
+      <w:r>
+        <w:t>contacting</w:t>
+      </w:r>
+      <w:proofErr w:type="gramEnd"/>
+      <w:r>
+        <w:t xml:space="preserve"> with the mind. Gold, silver, pearls, gems, trees, stones, beds, chairs, tables, and so on—regarding all of these, understanding first comes in accordance with the names given to them in the world, in accordance with the values given to them: "A very valuable thing that must be in every home." In this way, as desire grows in the world, one grasps it with the mind. But when reflecting slowly, what is present here? The understanding comes that "this is an empty thing, a hollow thing." One realizes, in the end, that it is only something created from within the mind, only something embraced by the mind. Just as when one feels that banana trunk slowly, sheath by sheath, one understands in the end that there is no core, similarly, here there is only a pile of thoughts, a pile of thoughts. There is nothing to be taken as "myself" or "mine." A multitude of thoughts arise and cease.</w:t>
       </w:r>
     </w:p>
     <w:p>
       <w:r>
-        <w:t xml:space="preserve">If we think about it in a way we can understand, what does a human being do as long as they live? Every word, every action, whatever they do with their mind, speech, and body—each of these, when looked at closely, is a series of "preparations" and "fashions". When you think about life, looking at all the activities done from morning till night, they all seem like a pile of "preparations". Just like getting ready to go on a journey; not only that, even this breathing in and breathing out is itself a preparation. Therefore, when a dying person ceases to breathe, those preparations and fashions he made while living all come to an end there. They are </w:t>
-      </w:r>
-      <w:r>
-        <w:t>*Anicca* (Impermanent)</w:t>
-      </w:r>
-      <w:r>
-        <w:t>. There is no stability. It is so regarding everything.</w:t>
+        <w:t xml:space="preserve">It is when one thinks and reflects in that way that this Dhamma is understood most deeply. The Blessed One has declared the Four Noble Truths—the entire </w:t>
+      </w:r>
+      <w:proofErr w:type="spellStart"/>
+      <w:r>
+        <w:t>saṁsāric</w:t>
+      </w:r>
+      <w:proofErr w:type="spellEnd"/>
+      <w:r>
+        <w:t xml:space="preserve"> existence, this five-aggregate bundle of form, Feeling (*</w:t>
+      </w:r>
+      <w:proofErr w:type="spellStart"/>
+      <w:r>
+        <w:t>vedanā</w:t>
+      </w:r>
+      <w:proofErr w:type="spellEnd"/>
+      <w:r>
+        <w:t>*), perception, Formations (*</w:t>
+      </w:r>
+      <w:proofErr w:type="spellStart"/>
+      <w:r>
+        <w:t>saṅkhāra</w:t>
+      </w:r>
+      <w:proofErr w:type="spellEnd"/>
+      <w:r>
+        <w:t>*), and Consciousness (*</w:t>
+      </w:r>
+      <w:proofErr w:type="spellStart"/>
+      <w:r>
+        <w:t>viññāṇa</w:t>
+      </w:r>
+      <w:proofErr w:type="spellEnd"/>
+      <w:r>
+        <w:t>*), is Impermanent (*</w:t>
+      </w:r>
+      <w:proofErr w:type="spellStart"/>
+      <w:r>
+        <w:t>anicca</w:t>
+      </w:r>
+      <w:proofErr w:type="spellEnd"/>
+      <w:r>
+        <w:t>*), Suffering (*dukkha*), and Not-self (*</w:t>
+      </w:r>
+      <w:proofErr w:type="spellStart"/>
+      <w:r>
+        <w:t>anattā</w:t>
+      </w:r>
+      <w:proofErr w:type="spellEnd"/>
+      <w:r>
+        <w:t>*). All of these are full of Suffering (*dukkha*). The Truth of Suffering (*dukkha-</w:t>
+      </w:r>
+      <w:proofErr w:type="spellStart"/>
+      <w:r>
+        <w:t>sacca</w:t>
+      </w:r>
+      <w:proofErr w:type="spellEnd"/>
+      <w:r>
+        <w:t>*). The truth regarding Suffering (*dukkha*) in the world. This Suffering (*dukkha*) arises because of the Craving (*</w:t>
+      </w:r>
+      <w:proofErr w:type="spellStart"/>
+      <w:r>
+        <w:t>taṇhā</w:t>
+      </w:r>
+      <w:proofErr w:type="spellEnd"/>
+      <w:r>
+        <w:t>*) that the world has towards this. It was because of the Craving (*</w:t>
+      </w:r>
+      <w:proofErr w:type="spellStart"/>
+      <w:r>
+        <w:t>taṇhā</w:t>
+      </w:r>
+      <w:proofErr w:type="spellEnd"/>
+      <w:r>
+        <w:t>*) that child had towards that bag of gold coins that such a Suffering (*dukkha*) arose, when he went to listen to that word of Dhamma. Then, the understanding of that Suffering (*dukkha*) arose. Beneath that Suffering (*dukkha*) is Craving (*</w:t>
+      </w:r>
+      <w:proofErr w:type="spellStart"/>
+      <w:r>
+        <w:t>taṇhā</w:t>
+      </w:r>
+      <w:proofErr w:type="spellEnd"/>
+      <w:r>
+        <w:t>*). The state where this Craving (*</w:t>
+      </w:r>
+      <w:proofErr w:type="spellStart"/>
+      <w:r>
+        <w:t>taṇhā</w:t>
+      </w:r>
+      <w:proofErr w:type="spellEnd"/>
+      <w:r>
+        <w:t xml:space="preserve">*) is destroyed, where it is appeased, is </w:t>
+      </w:r>
+      <w:proofErr w:type="spellStart"/>
+      <w:r>
+        <w:t>Nibbāna</w:t>
+      </w:r>
+      <w:proofErr w:type="spellEnd"/>
+      <w:r>
+        <w:t xml:space="preserve">. When that child abandoned the desire for the bag of gold coins and then the Dhamma began to be </w:t>
+      </w:r>
+      <w:r>
+        <w:lastRenderedPageBreak/>
+        <w:t xml:space="preserve">understood, </w:t>
+      </w:r>
+      <w:proofErr w:type="spellStart"/>
+      <w:r>
+        <w:t>Nibbāna</w:t>
+      </w:r>
+      <w:proofErr w:type="spellEnd"/>
+      <w:r>
+        <w:t xml:space="preserve"> was realized. What helps in that is what is called the Noble Eightfold Path: right view (*</w:t>
+      </w:r>
+      <w:proofErr w:type="spellStart"/>
+      <w:r>
+        <w:t>sammā-diṭṭhi</w:t>
+      </w:r>
+      <w:proofErr w:type="spellEnd"/>
+      <w:r>
+        <w:t>*), right intention (*</w:t>
+      </w:r>
+      <w:proofErr w:type="spellStart"/>
+      <w:r>
+        <w:t>sammā-saṅkappa</w:t>
+      </w:r>
+      <w:proofErr w:type="spellEnd"/>
+      <w:r>
+        <w:t>*), right speech (*</w:t>
+      </w:r>
+      <w:proofErr w:type="spellStart"/>
+      <w:r>
+        <w:t>sammā-vācā</w:t>
+      </w:r>
+      <w:proofErr w:type="spellEnd"/>
+      <w:r>
+        <w:t>*), right action (*</w:t>
+      </w:r>
+      <w:proofErr w:type="spellStart"/>
+      <w:r>
+        <w:t>sammā-kammanta</w:t>
+      </w:r>
+      <w:proofErr w:type="spellEnd"/>
+      <w:r>
+        <w:t>*), right livelihood (*</w:t>
+      </w:r>
+      <w:proofErr w:type="spellStart"/>
+      <w:r>
+        <w:t>sammā-ājīva</w:t>
+      </w:r>
+      <w:proofErr w:type="spellEnd"/>
+      <w:r>
+        <w:t>*), right effort (*</w:t>
+      </w:r>
+      <w:proofErr w:type="spellStart"/>
+      <w:r>
+        <w:t>sammā-vāyāma</w:t>
+      </w:r>
+      <w:proofErr w:type="spellEnd"/>
+      <w:r>
+        <w:t>*), right mindfulness (*</w:t>
+      </w:r>
+      <w:proofErr w:type="spellStart"/>
+      <w:r>
+        <w:t>sammā</w:t>
+      </w:r>
+      <w:proofErr w:type="spellEnd"/>
+      <w:r>
+        <w:t>-sati*), and right concentration (*</w:t>
+      </w:r>
+      <w:proofErr w:type="spellStart"/>
+      <w:r>
+        <w:t>sammā-samādhi</w:t>
+      </w:r>
+      <w:proofErr w:type="spellEnd"/>
+      <w:r>
+        <w:t>*). That is, this right view, right thoughts and intentions that go in accordance with right view, right action that goes in accordance with right thoughts, right livelihood that goes in accordance with right action, right effort—striving—the effort to purify the mind in accordance with right livelihood, and the right mindfulness—called *sati*—that arises through that, and the right concentration (*</w:t>
+      </w:r>
+      <w:proofErr w:type="spellStart"/>
+      <w:r>
+        <w:t>samyak-samādhi</w:t>
+      </w:r>
+      <w:proofErr w:type="spellEnd"/>
+      <w:r>
+        <w:t xml:space="preserve">*)—the right one-pointedness of mind, composure—that arises based on that mindfulness. In this way, the Eightfold Path is that fourth truth. It is through the understanding of these Four Noble Truths that anyone—be they great or small, be they a seven-year-old child or a sixty- or seventy-year-old </w:t>
+      </w:r>
+      <w:proofErr w:type="gramStart"/>
+      <w:r>
+        <w:t>person—attains</w:t>
+      </w:r>
+      <w:proofErr w:type="gramEnd"/>
+      <w:r>
+        <w:t xml:space="preserve"> the paths and fruits. Through deeply understanding such profound Dhamma in this way. This is not something expressed in words, but a Dhamma to be understood entirely within. When reflecting accordingly on the benefits that can be taken into life from this Dhamma, if they have understood them correctly, anyone can raise all of them into meditation and attention (*</w:t>
+      </w:r>
+      <w:proofErr w:type="spellStart"/>
+      <w:r>
+        <w:t>manasikāra</w:t>
+      </w:r>
+      <w:proofErr w:type="spellEnd"/>
+      <w:r>
+        <w:t xml:space="preserve">*) in their daily lives, within their everyday life problems. They can include a multitude of virtues that help towards </w:t>
+      </w:r>
+      <w:proofErr w:type="spellStart"/>
+      <w:r>
+        <w:t>Nibbāna</w:t>
+      </w:r>
+      <w:proofErr w:type="spellEnd"/>
+      <w:r>
+        <w:t>—a multitude of meritorious phenomena born of meditation—within their mental continuum. Thus, this is the example to be taken from the Dhamma story of the young child named Kāla.</w:t>
       </w:r>
     </w:p>
     <w:p>
       <w:r>
-        <w:t xml:space="preserve">So, if we think about this child, he was expecting to grasp a phrase of the Dhamma. Looking at it this way, what is present here is only the "preparing" to grasp the Dhamma phrase. He prepares, it does not work out; he looks at the next, he prepares, that too does not work out—this is what the child had to experience. This is what is called </w:t>
-      </w:r>
-      <w:r>
-        <w:t>*Saṅkhāra* (Formations)</w:t>
-      </w:r>
-      <w:r>
-        <w:t xml:space="preserve">. Here, there is only a pile of preparations. All of these are </w:t>
-      </w:r>
-      <w:r>
-        <w:t>*Anicca* (Impermanent)</w:t>
-      </w:r>
-      <w:r>
-        <w:t>. This preparing, this fashioning—all of this is impermanent. Why? Because not even a single Dhamma phrase can be grasped. It slips away. This was due to a certain skillful means employed by the Buddha.</w:t>
+        <w:t>Even though many things in this world appear dark, they can be made white if one abandons that wrong understanding in this Dhamma—abandoning the wrong reflection called unwise attention (*</w:t>
+      </w:r>
+      <w:proofErr w:type="spellStart"/>
+      <w:r>
+        <w:t>ayoniso</w:t>
+      </w:r>
+      <w:proofErr w:type="spellEnd"/>
+      <w:r>
+        <w:t xml:space="preserve"> </w:t>
+      </w:r>
+      <w:proofErr w:type="spellStart"/>
+      <w:r>
+        <w:t>manasikāra</w:t>
+      </w:r>
+      <w:proofErr w:type="spellEnd"/>
+      <w:r>
+        <w:t xml:space="preserve">*)—and trains in the direction of correct understanding, called </w:t>
+      </w:r>
+      <w:proofErr w:type="gramStart"/>
+      <w:r>
+        <w:t>Wise</w:t>
+      </w:r>
+      <w:proofErr w:type="gramEnd"/>
+      <w:r>
+        <w:t xml:space="preserve"> attention (*</w:t>
+      </w:r>
+      <w:proofErr w:type="spellStart"/>
+      <w:r>
+        <w:t>yoniso</w:t>
+      </w:r>
+      <w:proofErr w:type="spellEnd"/>
+      <w:r>
+        <w:t xml:space="preserve"> </w:t>
+      </w:r>
+      <w:proofErr w:type="spellStart"/>
+      <w:r>
+        <w:t>manasikāra</w:t>
+      </w:r>
+      <w:proofErr w:type="spellEnd"/>
+      <w:r>
+        <w:t>*). If one abandons that attitude of looking at the world in a wrong way and trains in looking at the world in the correct way, then that person can, perhaps even in the midst of their daily activities, extract subjects of meditation (*</w:t>
+      </w:r>
+      <w:proofErr w:type="spellStart"/>
+      <w:r>
+        <w:t>kammaṭṭhāna</w:t>
+      </w:r>
+      <w:proofErr w:type="spellEnd"/>
+      <w:r>
+        <w:t>*) from within them and obtain the realization of the paths and fruits. In various stories of the Buddha's time, it is mentioned that some elders (*</w:t>
+      </w:r>
+      <w:proofErr w:type="spellStart"/>
+      <w:r>
+        <w:t>theras</w:t>
+      </w:r>
+      <w:proofErr w:type="spellEnd"/>
+      <w:r>
+        <w:t>* and *</w:t>
+      </w:r>
+      <w:proofErr w:type="spellStart"/>
+      <w:r>
+        <w:t>therīs</w:t>
+      </w:r>
+      <w:proofErr w:type="spellEnd"/>
+      <w:r>
+        <w:t xml:space="preserve">*), some members of the </w:t>
+      </w:r>
+      <w:proofErr w:type="spellStart"/>
+      <w:r>
+        <w:t>Saṅgha</w:t>
+      </w:r>
+      <w:proofErr w:type="spellEnd"/>
+      <w:r>
+        <w:t xml:space="preserve">, attained </w:t>
+      </w:r>
+      <w:proofErr w:type="spellStart"/>
+      <w:r>
+        <w:t>Arahantship</w:t>
+      </w:r>
+      <w:proofErr w:type="spellEnd"/>
+      <w:r>
+        <w:t xml:space="preserve"> upon seeing a lamp being extinguished—when they went to sleep and tried to reduce and extinguish the flame of a lamp. Some saw a forest fire, some saw a mass of foam floating on water, and seeing various such things, they realized </w:t>
+      </w:r>
+      <w:proofErr w:type="spellStart"/>
+      <w:r>
+        <w:t>Nibbāna</w:t>
+      </w:r>
+      <w:proofErr w:type="spellEnd"/>
+      <w:r>
+        <w:t xml:space="preserve"> through them. Through every single one of them, they developed a deep understanding of the world. Using one example present in the world, when the ability to wisely think, "other things are just like this too," arises, then that person can obtain the realization of the supramundane paths and fruits. </w:t>
+      </w:r>
+      <w:proofErr w:type="gramStart"/>
+      <w:r>
+        <w:t>At this time</w:t>
+      </w:r>
+      <w:proofErr w:type="gramEnd"/>
+      <w:r>
+        <w:t xml:space="preserve">, just as during the Buddha's time, or perhaps even more, various kinds of Suffering (*dukkha*), hardships, and disasters are heard of in this world and society. One can extract </w:t>
+      </w:r>
+      <w:proofErr w:type="spellStart"/>
+      <w:r>
+        <w:t>Nibbāna</w:t>
+      </w:r>
+      <w:proofErr w:type="spellEnd"/>
+      <w:r>
+        <w:t xml:space="preserve"> through them.</w:t>
       </w:r>
     </w:p>
     <w:p>
       <w:r>
-        <w:t xml:space="preserve">Thereupon, this child looks at his own mind. "What is happening to my experience?" he thinks. As the mind reflects within itself in this way, thoughts arise one by one. Thoughts like bags of gold coins come and go, come and go. When examined, what is there is impermanence, vanishing. They come and go. When tracing this characteristic, the child must have understood: these are *saṅkhāra*—all of these are merely preparations, a pile of fashions. They come and go, come and go. Then, this coming-and-going nature, the very effort made to grasp those *saṅkhāra*, is the cause of that state of </w:t>
-      </w:r>
-      <w:r>
-        <w:t>*Dukkha* (Suffering)</w:t>
-      </w:r>
-      <w:r>
-        <w:t>.</w:t>
+        <w:t xml:space="preserve">Likewise, regarding the bag of gold coins mentioned about </w:t>
+      </w:r>
+      <w:proofErr w:type="spellStart"/>
+      <w:r>
+        <w:t>Kāla</w:t>
+      </w:r>
+      <w:proofErr w:type="spellEnd"/>
+      <w:r>
+        <w:t>—just like that bag of gold coins, in this era too, one hears so much along the roads about 'jackpots' (*</w:t>
+      </w:r>
+      <w:proofErr w:type="spellStart"/>
+      <w:r>
+        <w:t>jaya-malu</w:t>
+      </w:r>
+      <w:proofErr w:type="spellEnd"/>
+      <w:r>
+        <w:t>*) and 'fortune bags' (*</w:t>
+      </w:r>
+      <w:proofErr w:type="spellStart"/>
+      <w:r>
+        <w:t>vāsana-malu</w:t>
+      </w:r>
+      <w:proofErr w:type="spellEnd"/>
+      <w:r>
+        <w:t xml:space="preserve">*). There must be thousands, lakhs of people who buy tickets hoping for these jackpots and fortune bags. Not everyone wins these jackpots and fortune </w:t>
+      </w:r>
+      <w:r>
+        <w:lastRenderedPageBreak/>
+        <w:t xml:space="preserve">bags. It does not matter if they are not obtained. Through them, just as that child </w:t>
+      </w:r>
+      <w:proofErr w:type="spellStart"/>
+      <w:r>
+        <w:t>Kāla</w:t>
+      </w:r>
+      <w:proofErr w:type="spellEnd"/>
+      <w:r>
+        <w:t xml:space="preserve"> did, one must try to draw closer to the Dhamma. What is present here? Whether this jackpot, this fortune bag is obtained or not, this is the nature of this life. Everything is Impermanent (*</w:t>
+      </w:r>
+      <w:proofErr w:type="spellStart"/>
+      <w:r>
+        <w:t>anicca</w:t>
+      </w:r>
+      <w:proofErr w:type="spellEnd"/>
+      <w:r>
+        <w:t xml:space="preserve">*). Every effort made in pursuit of impermanent things is full of Suffering (*dukkha*). If the truth in the world is such, there is nothing here to be taken as "myself" or "mine." There is no essence, no core. All of these must be abandoned </w:t>
+      </w:r>
+      <w:proofErr w:type="gramStart"/>
+      <w:r>
+        <w:t>at the moment</w:t>
+      </w:r>
+      <w:proofErr w:type="gramEnd"/>
+      <w:r>
+        <w:t xml:space="preserve"> of death. All those collections of wealth, relatives, and friends, which were taken as "</w:t>
+      </w:r>
+      <w:proofErr w:type="gramStart"/>
+      <w:r>
+        <w:t>myself</w:t>
+      </w:r>
+      <w:proofErr w:type="gramEnd"/>
+      <w:r>
+        <w:t>" and "mine," must be abandoned and left behind. In the end, the relatives gather and hang a banner: "</w:t>
+      </w:r>
+      <w:proofErr w:type="spellStart"/>
+      <w:r>
+        <w:t>Aniccā</w:t>
+      </w:r>
+      <w:proofErr w:type="spellEnd"/>
+      <w:r>
+        <w:t xml:space="preserve"> </w:t>
+      </w:r>
+      <w:proofErr w:type="spellStart"/>
+      <w:r>
+        <w:t>vata</w:t>
+      </w:r>
+      <w:proofErr w:type="spellEnd"/>
+      <w:r>
+        <w:t xml:space="preserve"> </w:t>
+      </w:r>
+      <w:proofErr w:type="spellStart"/>
+      <w:r>
+        <w:t>saṅkhārā</w:t>
+      </w:r>
+      <w:proofErr w:type="spellEnd"/>
+      <w:r>
+        <w:t>" or "</w:t>
+      </w:r>
+      <w:proofErr w:type="spellStart"/>
+      <w:r>
+        <w:t>Sabbē</w:t>
+      </w:r>
+      <w:proofErr w:type="spellEnd"/>
+      <w:r>
+        <w:t xml:space="preserve"> </w:t>
+      </w:r>
+      <w:proofErr w:type="spellStart"/>
+      <w:r>
+        <w:t>saṅkhārā</w:t>
+      </w:r>
+      <w:proofErr w:type="spellEnd"/>
+      <w:r>
+        <w:t xml:space="preserve"> </w:t>
+      </w:r>
+      <w:proofErr w:type="spellStart"/>
+      <w:r>
+        <w:t>aniccā</w:t>
+      </w:r>
+      <w:proofErr w:type="spellEnd"/>
+      <w:r>
+        <w:t xml:space="preserve">." When they hang them, that person has already died. There is no time to </w:t>
+      </w:r>
+      <w:proofErr w:type="gramStart"/>
+      <w:r>
+        <w:t>make an effort</w:t>
+      </w:r>
+      <w:proofErr w:type="gramEnd"/>
+      <w:r>
+        <w:t xml:space="preserve"> towards those supramundane states. Everything—the entire life—is a series of designs, a series of preparations, as we said. It is just like some people who are preparing to go on a journey and sometimes see a dream. Just like preparing to go on a great journey, a pilgrimage or a pleasure trip. They prepare, but something is missing. They run back and complete that too—regarding clothes and ornaments. While doing so, suddenly they wake up, and they do not even get to go on the journey. Such is the thing done throughout the entire life. From young child to old man, the entire life is a series of designs and preparations. But the nature of Suffering (*dukkha*) within this is not understood. Just like the person who carried the banana trunk, the pile of sheaths </w:t>
+      </w:r>
+      <w:proofErr w:type="gramStart"/>
+      <w:r>
+        <w:t>present</w:t>
+      </w:r>
+      <w:proofErr w:type="gramEnd"/>
+      <w:r>
+        <w:t xml:space="preserve"> there is not seen. To see that pile of sheaths is why we meditate. As the mind becomes calmer and calmer, it is seen: "Here there are only these phenomena—Feeling (*</w:t>
+      </w:r>
+      <w:proofErr w:type="spellStart"/>
+      <w:r>
+        <w:t>vedanā</w:t>
+      </w:r>
+      <w:proofErr w:type="spellEnd"/>
+      <w:r>
+        <w:t>*), perception, volition, Contact (*</w:t>
+      </w:r>
+      <w:proofErr w:type="spellStart"/>
+      <w:r>
+        <w:t>phassa</w:t>
+      </w:r>
+      <w:proofErr w:type="spellEnd"/>
+      <w:r>
+        <w:t xml:space="preserve">*), and attention—only this much is present." What are called earth, water, fire, and wind—both external things in this world and our bodies—all of these are only the four elements of which they are constructed. There is nothing beyond this. "For an infinite time in </w:t>
+      </w:r>
+      <w:proofErr w:type="spellStart"/>
+      <w:r>
+        <w:t>saṁsāra</w:t>
+      </w:r>
+      <w:proofErr w:type="spellEnd"/>
+      <w:r>
+        <w:t>, we have run in pursuit of these. Here there is only running, only Craving (*</w:t>
+      </w:r>
+      <w:proofErr w:type="spellStart"/>
+      <w:r>
+        <w:t>taṇhā</w:t>
+      </w:r>
+      <w:proofErr w:type="spellEnd"/>
+      <w:r>
+        <w:t>*), only thirst." Such an understanding arises to one.</w:t>
       </w:r>
     </w:p>
     <w:p>
       <w:r>
-        <w:t>Suffering arises, and then the child must have felt a weariness; the effort he makes becomes futile. When they go in such a way that not even one can be grasped, to the point of aversion, even to the point where the idea of the bag of gold coins disappears, like a grand joke, every Dhamma phrase arises and ends here. He looks, but when the child understands the impermanent nature to this extent, the second characteristic declared by the Buddha becomes clear: "If it is impermanent, it is suffering. *Yadaniccaṁ taṁ dukkhaṁ*"—"what is impermanent is suffering", so the Buddha declared. Then, the Buddha declared another thing: "*Yaṁ dukkhaṁ taṁ anattā*"—"what is suffering is not-self, there is nothing to be taken as 'I' or 'mine'—nothing to grasp, no core." The child must have realized, as things like the bag of gold coins arise and slip away, not one remains. None of those belong to him; there is nothing to be taken as "I" or "mine"—nothing to grasp, no core. All thoughts arise and get swept away.</w:t>
+        <w:t xml:space="preserve">It is when that understanding has arisen that, as the Blessed One declared, one can obtain that state of Stream-entry, which is superior to even the empire of a wheel-turning monarch, superior to going to heaven, superior to lordship over the entire world. If one has obtained that state, one will be reborn at most seven times. Developing further the Noble Eightfold Path one has entered, and meditating even deeper, that person can obtain the second path and fruit, called </w:t>
+      </w:r>
+      <w:proofErr w:type="gramStart"/>
+      <w:r>
+        <w:t>Once-returning</w:t>
+      </w:r>
+      <w:proofErr w:type="gramEnd"/>
+      <w:r>
+        <w:t xml:space="preserve"> (*</w:t>
+      </w:r>
+      <w:proofErr w:type="spellStart"/>
+      <w:r>
+        <w:t>Sakadāgāmi</w:t>
+      </w:r>
+      <w:proofErr w:type="spellEnd"/>
+      <w:r>
+        <w:t xml:space="preserve">*), leaving only one more return to this world, escaping from the rest of </w:t>
+      </w:r>
+      <w:proofErr w:type="spellStart"/>
+      <w:r>
+        <w:t>saṁsāric</w:t>
+      </w:r>
+      <w:proofErr w:type="spellEnd"/>
+      <w:r>
+        <w:t xml:space="preserve"> Suffering (*dukkha*). If they develop meditation even deeper beyond that, by turning once again that Wheel of Dhamma they set in motion, they arrive at the state of Non-returning (*Anāgāmi*), and without returning to this world, they can realize </w:t>
+      </w:r>
+      <w:proofErr w:type="spellStart"/>
+      <w:r>
+        <w:t>Nibbāna</w:t>
+      </w:r>
+      <w:proofErr w:type="spellEnd"/>
+      <w:r>
+        <w:t xml:space="preserve"> in the Brahma world itself. Striving even further beyond that, meditating deeply, one can </w:t>
+      </w:r>
+      <w:proofErr w:type="gramStart"/>
+      <w:r>
+        <w:t>completely destroy</w:t>
+      </w:r>
+      <w:proofErr w:type="gramEnd"/>
+      <w:r>
+        <w:t xml:space="preserve"> these defilements and free oneself from the entire </w:t>
+      </w:r>
+      <w:proofErr w:type="spellStart"/>
+      <w:r>
+        <w:t>saṁsāric</w:t>
+      </w:r>
+      <w:proofErr w:type="spellEnd"/>
+      <w:r>
+        <w:t xml:space="preserve"> Suffering (*dukkha*) of Birth (*</w:t>
+      </w:r>
+      <w:proofErr w:type="spellStart"/>
+      <w:r>
+        <w:t>jāti</w:t>
+      </w:r>
+      <w:proofErr w:type="spellEnd"/>
+      <w:r>
+        <w:t>*), Aging and Death (*</w:t>
+      </w:r>
+      <w:proofErr w:type="spellStart"/>
+      <w:r>
+        <w:t>jarāmaraṇa</w:t>
+      </w:r>
+      <w:proofErr w:type="spellEnd"/>
+      <w:r>
+        <w:t xml:space="preserve">*), and disease, finding peace in the noble and supreme </w:t>
+      </w:r>
+      <w:proofErr w:type="spellStart"/>
+      <w:r>
+        <w:t>Nibbāna</w:t>
+      </w:r>
+      <w:proofErr w:type="spellEnd"/>
+      <w:r>
+        <w:t>.</w:t>
       </w:r>
     </w:p>
     <w:p>
       <w:r>
-        <w:t>Next, this child deeply reflects on the nature of these thoughts. Here, there is entirely a pile of thoughts arising and ceasing. There is nothing here to grasp as "I" or "mine", no core.</w:t>
+        <w:t xml:space="preserve">Thus, through the story of this treasurer's son named Kāla, we were able to establish our minds on the path to </w:t>
+      </w:r>
+      <w:proofErr w:type="spellStart"/>
+      <w:r>
+        <w:t>Nibbāna</w:t>
+      </w:r>
+      <w:proofErr w:type="spellEnd"/>
+      <w:r>
+        <w:t xml:space="preserve">. We can say without fear that if one goes very deep into even a single word of Dhamma preached by the Blessed One, </w:t>
+      </w:r>
+      <w:proofErr w:type="spellStart"/>
+      <w:r>
+        <w:t>Nibbāna</w:t>
+      </w:r>
+      <w:proofErr w:type="spellEnd"/>
+      <w:r>
+        <w:t xml:space="preserve"> is present there. If we take </w:t>
+      </w:r>
+      <w:r>
+        <w:lastRenderedPageBreak/>
+        <w:t>one drop from this ocean of Dhamma of the Blessed One, in every single one of them there is the taste of liberation (*</w:t>
+      </w:r>
+      <w:proofErr w:type="spellStart"/>
+      <w:r>
+        <w:t>vimutti</w:t>
+      </w:r>
+      <w:proofErr w:type="spellEnd"/>
+      <w:r>
+        <w:t xml:space="preserve">-rasa*), the taste of </w:t>
+      </w:r>
+      <w:proofErr w:type="spellStart"/>
+      <w:r>
+        <w:t>Nibbāna</w:t>
+      </w:r>
+      <w:proofErr w:type="spellEnd"/>
+      <w:r>
+        <w:t xml:space="preserve">. Just as a drop of water taken from anywhere in the great ocean has the taste of salt, even if we take one small word of Dhamma from the ocean of Dhamma, through it we can direct our minds all the way to </w:t>
+      </w:r>
+      <w:proofErr w:type="spellStart"/>
+      <w:r>
+        <w:t>Nibbāna</w:t>
+      </w:r>
+      <w:proofErr w:type="spellEnd"/>
+      <w:r>
+        <w:t xml:space="preserve">. For someone who has developed the objects of meditation in </w:t>
+      </w:r>
+      <w:proofErr w:type="spellStart"/>
+      <w:r>
+        <w:t>saṁsāra</w:t>
+      </w:r>
+      <w:proofErr w:type="spellEnd"/>
+      <w:r>
+        <w:t xml:space="preserve">, they can realize </w:t>
+      </w:r>
+      <w:proofErr w:type="spellStart"/>
+      <w:r>
+        <w:t>Nibbāna</w:t>
+      </w:r>
+      <w:proofErr w:type="spellEnd"/>
+      <w:r>
+        <w:t xml:space="preserve"> even </w:t>
+      </w:r>
+      <w:proofErr w:type="gramStart"/>
+      <w:r>
+        <w:t>at the moment</w:t>
+      </w:r>
+      <w:proofErr w:type="gramEnd"/>
+      <w:r>
+        <w:t xml:space="preserve"> of listening to the Dhamma.</w:t>
       </w:r>
     </w:p>
     <w:p>
       <w:r>
-        <w:t xml:space="preserve">Ah, the simile associated with this word </w:t>
-      </w:r>
-      <w:r>
-        <w:t>*Saṅkhāra* (Formations)</w:t>
-      </w:r>
-      <w:r>
-        <w:t xml:space="preserve"> is a very wonderful simile. The Buddha has declared this for us to understand easily: "*Saṅkhārā kadalūpamā*"—"preparations are like a banana trunk". We all know what a banana trunk is. The Buddha shows this like a story. Suppose there is a man who has never seen a banana tree. When he goes into a forest, he sees a banana tree for the first time. Looking at this banana trunk, he thinks there is heartwood (core) inside, and that it would be useful for something. He comes home thinking, "I will make a cupboard out of this." With this thought, he cuts down the banana trunk and brings it.</w:t>
+        <w:t xml:space="preserve">The Blessed One has declared that the realization of the paths and fruits can be obtained not only on the meditation seat, but </w:t>
+      </w:r>
+      <w:proofErr w:type="gramStart"/>
+      <w:r>
+        <w:t>at</w:t>
+      </w:r>
+      <w:proofErr w:type="gramEnd"/>
+      <w:r>
+        <w:t xml:space="preserve"> five places. They are called the "bases of liberation" (*</w:t>
+      </w:r>
+      <w:proofErr w:type="spellStart"/>
+      <w:r>
+        <w:t>vimuttāyatana</w:t>
+      </w:r>
+      <w:proofErr w:type="spellEnd"/>
+      <w:r>
+        <w:t>*). Liberation (*</w:t>
+      </w:r>
+      <w:proofErr w:type="spellStart"/>
+      <w:r>
+        <w:t>vimukti</w:t>
+      </w:r>
+      <w:proofErr w:type="spellEnd"/>
+      <w:r>
+        <w:t xml:space="preserve">*) means freedom—freedom from </w:t>
+      </w:r>
+      <w:proofErr w:type="spellStart"/>
+      <w:r>
+        <w:t>saṁsāra</w:t>
+      </w:r>
+      <w:proofErr w:type="spellEnd"/>
+      <w:r>
+        <w:t>. Bases (*</w:t>
+      </w:r>
+      <w:proofErr w:type="spellStart"/>
+      <w:r>
+        <w:t>āyatana</w:t>
+      </w:r>
+      <w:proofErr w:type="spellEnd"/>
+      <w:r>
+        <w:t xml:space="preserve">*) mean a certain center, a place where one can obtain that freedom. Five such places are shown. What are those five places? One can realize liberation when listening to the Dhamma. It was when listening to the Dhamma that this child named </w:t>
+      </w:r>
+      <w:proofErr w:type="spellStart"/>
+      <w:r>
+        <w:t>Kāla</w:t>
+      </w:r>
+      <w:proofErr w:type="spellEnd"/>
+      <w:r>
+        <w:t xml:space="preserve"> realized </w:t>
+      </w:r>
+      <w:proofErr w:type="spellStart"/>
+      <w:r>
+        <w:t>Nibbāna</w:t>
+      </w:r>
+      <w:proofErr w:type="spellEnd"/>
+      <w:r>
+        <w:t xml:space="preserve">. When listening to the Dhamma, directing the mind well to it, when the moment of deep reflection arrives, one can obtain that supramundane state. Another can do so when preaching the Dhamma—while preaching the Dhamma, when maintaining the mind on the Dhamma... Just as when preparing food for guests, it is not only the guests who can partake, but others too can satisfy their hunger; in the same way, it is shown that some members of the </w:t>
+      </w:r>
+      <w:proofErr w:type="spellStart"/>
+      <w:r>
+        <w:t>Saṅgha</w:t>
+      </w:r>
+      <w:proofErr w:type="spellEnd"/>
+      <w:r>
+        <w:t xml:space="preserve"> obtained realization </w:t>
+      </w:r>
+      <w:proofErr w:type="gramStart"/>
+      <w:r>
+        <w:t>at the moment</w:t>
+      </w:r>
+      <w:proofErr w:type="gramEnd"/>
+      <w:r>
+        <w:t xml:space="preserve"> of preaching the Dhamma. Likewise, when reflecting on the Dhamma—when reflecting on a deep point of the Dhamma in solitude, suddenly a correct and deep understanding arrives, and one can realize </w:t>
+      </w:r>
+      <w:proofErr w:type="spellStart"/>
+      <w:r>
+        <w:t>Nibbāna</w:t>
+      </w:r>
+      <w:proofErr w:type="spellEnd"/>
+      <w:r>
+        <w:t xml:space="preserve"> through such a realization of the paths and fruits. For some others, when reciting the Dhamma—when reciting the Dhamma with the mind well-directed, then too, the mind becomes calm and concentrated, a deep understanding of it arrives, and they can obtain those fruits like Stream-entry. They can also become Arahants. Finally, what is shown is taking some sign of concentration (*</w:t>
+      </w:r>
+      <w:proofErr w:type="spellStart"/>
+      <w:r>
+        <w:t>samādhi-nimitta</w:t>
+      </w:r>
+      <w:proofErr w:type="spellEnd"/>
+      <w:r>
+        <w:t xml:space="preserve">*)—which is what is generally considered as meditation in the world—and by developing meditation systematically based on some sign of concentration, one can also realize liberation. In this way, if one engages in activities like listening to </w:t>
+      </w:r>
+      <w:proofErr w:type="gramStart"/>
+      <w:r>
+        <w:t>the Dhamma</w:t>
+      </w:r>
+      <w:proofErr w:type="gramEnd"/>
+      <w:r>
+        <w:t xml:space="preserve">, preaching </w:t>
+      </w:r>
+      <w:proofErr w:type="gramStart"/>
+      <w:r>
+        <w:t>the Dhamma</w:t>
+      </w:r>
+      <w:proofErr w:type="gramEnd"/>
+      <w:r>
+        <w:t xml:space="preserve">, and reflecting on </w:t>
+      </w:r>
+      <w:proofErr w:type="gramStart"/>
+      <w:r>
+        <w:t>the Dhamma</w:t>
+      </w:r>
+      <w:proofErr w:type="gramEnd"/>
+      <w:r>
+        <w:t xml:space="preserve"> in daily life, one can realize those paths and fruits. Accordingly, we must strive in our daily lives to take the benefits that can be obtained from this Dhamma into our own lives, </w:t>
+      </w:r>
+      <w:proofErr w:type="gramStart"/>
+      <w:r>
+        <w:t>in light of</w:t>
+      </w:r>
+      <w:proofErr w:type="gramEnd"/>
+      <w:r>
+        <w:t xml:space="preserve"> this story.</w:t>
       </w:r>
     </w:p>
     <w:p>
       <w:r>
-        <w:t>...that is what is detailed, but it is a simile given by the Buddha—he first peels off a sheath of the banana trunk he brought, expecting that there is heartwood. When he looks next, there is another sheath. Again, there is another sheath. In this way, he peels it sheath by sheath, and ultimately, until he stops holding the banana trunk, there is only a pile of sheaths. Looking at it this way, that person realizes for the first time by himself that there is no heartwood at all in the depths of the banana tree.</w:t>
+        <w:t>Today, then, this virtuous gathering has accumulated a vast amount of merit (*</w:t>
+      </w:r>
+      <w:proofErr w:type="spellStart"/>
+      <w:r>
+        <w:t>kusala</w:t>
+      </w:r>
+      <w:proofErr w:type="spellEnd"/>
+      <w:r>
+        <w:t xml:space="preserve">*) on this occasion by listening to this Dhamma. Listening to the Dhamma is not merely an ordinary custom; if one listens to the Dhamma directing the mind to </w:t>
+      </w:r>
+      <w:proofErr w:type="spellStart"/>
+      <w:r>
+        <w:t>Nibbāna</w:t>
+      </w:r>
+      <w:proofErr w:type="spellEnd"/>
+      <w:r>
+        <w:t>, it becomes a strong supportive condition (*</w:t>
+      </w:r>
+      <w:proofErr w:type="spellStart"/>
+      <w:r>
+        <w:t>upanissaya</w:t>
+      </w:r>
+      <w:proofErr w:type="spellEnd"/>
+      <w:r>
+        <w:t xml:space="preserve">*) for </w:t>
+      </w:r>
+      <w:proofErr w:type="spellStart"/>
+      <w:r>
+        <w:t>Nibbāna</w:t>
+      </w:r>
+      <w:proofErr w:type="spellEnd"/>
+      <w:r>
+        <w:t xml:space="preserve">. That we obtained this human existence, and developed a fondness and inclination for the Dhamma, is because we developed these as habits over a long period of time. Therefore, even for </w:t>
+      </w:r>
+      <w:proofErr w:type="spellStart"/>
+      <w:r>
+        <w:t>saṁsāra</w:t>
+      </w:r>
+      <w:proofErr w:type="spellEnd"/>
+      <w:r>
+        <w:t xml:space="preserve">, listening to this Dhamma is helpful. On those various occasions, if someone strives, they can, like that child </w:t>
+      </w:r>
+      <w:proofErr w:type="spellStart"/>
+      <w:r>
+        <w:t>Kāla</w:t>
+      </w:r>
+      <w:proofErr w:type="spellEnd"/>
+      <w:r>
+        <w:t xml:space="preserve">, obtain the noble realization of the paths and fruits through a single word of Dhamma. Therefore, on this occasion, you have observed the precepts and listened to the Dhamma. You have generated a vast accumulation of meritorious thoughts. You have accumulated a great deal of merit. Strive to make this merit of listening to the Dhamma, this merit, this wholesome condition, a support to realize the supreme bliss of </w:t>
+      </w:r>
+      <w:proofErr w:type="spellStart"/>
+      <w:r>
+        <w:t>Nibbāna</w:t>
+      </w:r>
+      <w:proofErr w:type="spellEnd"/>
+      <w:r>
+        <w:t xml:space="preserve">, by </w:t>
+      </w:r>
+      <w:r>
+        <w:lastRenderedPageBreak/>
+        <w:t>gradually attaining the paths and fruits beginning with Stream-entry (*</w:t>
+      </w:r>
+      <w:proofErr w:type="spellStart"/>
+      <w:r>
+        <w:t>Sotāpatti</w:t>
+      </w:r>
+      <w:proofErr w:type="spellEnd"/>
+      <w:r>
+        <w:t>*) in this very life.</w:t>
       </w:r>
     </w:p>
     <w:p>
       <w:r>
-        <w:t xml:space="preserve">That is the kind of simile the Buddha gives for this word *saṅkhāra*. Now we can understand a Sinhala word for *saṅkhāra* as "preparations", "fashions", "constructions". Then our entire life has this kind of nature; not just one for its own sake, but one for another, and another for yet another. When looking at them one by one, not even one has a core. All of them are </w:t>
-      </w:r>
-      <w:r>
-        <w:t>*Anicca* (Impermanent)</w:t>
-      </w:r>
-      <w:r>
-        <w:t>. Due to that very impermanent nature—now, looking at the side of a young child's life, there are expectations. When reflecting on the things that support those expectations, whether they are fulfilled or not, in a few days he becomes a young man. From the young man, there are certain expectations; before they are fulfilled, they change, and next, without him even realizing it, old age comes. There are certain expectations from the old person; before they are even fulfilled, sometimes, death occurs. In this way, the whole of life goes on as a pile of preparations, a pile of fashions.</w:t>
+        <w:t xml:space="preserve">Likewise, may you share this accumulated mass of merit with the guardian deities of the Dispensation, and whatever deities, spirits, and other beings reside in this place, so that they all may rejoice in it and find peace in the supreme, noble </w:t>
+      </w:r>
+      <w:proofErr w:type="spellStart"/>
+      <w:r>
+        <w:t>Nibbāna</w:t>
+      </w:r>
+      <w:proofErr w:type="spellEnd"/>
+      <w:r>
+        <w:t>, which is free from decay and death (*</w:t>
+      </w:r>
+      <w:proofErr w:type="spellStart"/>
+      <w:r>
+        <w:t>ajarāmara</w:t>
+      </w:r>
+      <w:proofErr w:type="spellEnd"/>
+      <w:r>
+        <w:t>*).</w:t>
       </w:r>
     </w:p>
     <w:p>
       <w:r>
-        <w:t>In this way, the fact that there is no core here, no core at all, and that one cannot bring them under one's control as one's own, must have been realized by that child named 'Kāla' as well, through his own meditation subject—his theme of meditation. What is its nature? The bag of gold coins. Through the bag of gold coins, this child must have realized, "this is how other things are too". It is said in this dispensation that seven-year-old children attained Arahantship. What specifically happens that a young child becomes a supreme being who guides the three worlds? This child reflects on the false transformation of thoughts. If there is past spiritual power, one understands the deep Dhamma through that past event. Something like this must have happened in the forest. Through the meditation on the bag of gold coins, the method by which the Buddha preached the Dhamma—that path of Dhamma—must have brought to light the factors relevant to meditation from within that bag of gold coins.</w:t>
+        <w:t xml:space="preserve">Similarly, if there are any departed relatives, friends, and others who have passed away, and whatever beings in this world-system, from </w:t>
+      </w:r>
+      <w:proofErr w:type="spellStart"/>
+      <w:r>
+        <w:t>Avīci</w:t>
+      </w:r>
+      <w:proofErr w:type="spellEnd"/>
+      <w:r>
+        <w:t xml:space="preserve"> hell up to the </w:t>
+      </w:r>
+      <w:proofErr w:type="spellStart"/>
+      <w:r>
+        <w:t>Akanitha</w:t>
+      </w:r>
+      <w:proofErr w:type="spellEnd"/>
+      <w:r>
+        <w:t xml:space="preserve"> heaven, who are hoping for </w:t>
+      </w:r>
+      <w:proofErr w:type="spellStart"/>
+      <w:r>
+        <w:t>Nibbāna</w:t>
+      </w:r>
+      <w:proofErr w:type="spellEnd"/>
+      <w:r>
+        <w:t xml:space="preserve">—may they all rejoice in this noble merit and, being freed from all </w:t>
+      </w:r>
+      <w:proofErr w:type="spellStart"/>
+      <w:r>
+        <w:t>saṁsāric</w:t>
+      </w:r>
+      <w:proofErr w:type="spellEnd"/>
+      <w:r>
+        <w:t xml:space="preserve"> Suffering (*dukkha*) of Birth (*</w:t>
+      </w:r>
+      <w:proofErr w:type="spellStart"/>
+      <w:r>
+        <w:t>jāti</w:t>
+      </w:r>
+      <w:proofErr w:type="spellEnd"/>
+      <w:r>
+        <w:t>*), Aging and Death (*</w:t>
+      </w:r>
+      <w:proofErr w:type="spellStart"/>
+      <w:r>
+        <w:t>jarāmaraṇa</w:t>
+      </w:r>
+      <w:proofErr w:type="spellEnd"/>
+      <w:r>
+        <w:t xml:space="preserve">*), and disease, find peace in the supreme, noble </w:t>
+      </w:r>
+      <w:proofErr w:type="spellStart"/>
+      <w:r>
+        <w:t>Nibbāna</w:t>
+      </w:r>
+      <w:proofErr w:type="spellEnd"/>
+      <w:r>
+        <w:t>, which is free from decay and death (*</w:t>
+      </w:r>
+      <w:proofErr w:type="spellStart"/>
+      <w:r>
+        <w:t>ajarāmara</w:t>
+      </w:r>
+      <w:proofErr w:type="spellEnd"/>
+      <w:r>
+        <w:t>*). Wishing thus, now recite these verses and share the merit.</w:t>
       </w:r>
     </w:p>
     <w:p>
       <w:r>
-        <w:t>Something said about this Dhamma and the practice of meditation is: how should we regard these things called *saṅkhāra*? In terms of *anicca*, *dukkha*, and *anattā*. When declaring these *saṅkhāra*—though we have given various names to each of these, if we express it in a way a meditator understands, we can realize that here there is only a pile of names and a pile of forms (*nāma* and *rūpa* / *nāmarūpa* [Name-and-Form]). Although we have placed names in the world calling them such-and-such things, when looked at from their perspective, according to how they are understood, the Buddha has shown the Dhamma in this way. Here there is—</w:t>
-      </w:r>
-      <w:r>
-        <w:t>*Vedanā* (Feeling)</w:t>
-      </w:r>
-      <w:r>
-        <w:t>—there is a thing called *vedanā*, there is perception (*saññā*), there is volition (*cetanā*), there is *phassa* (Contact), there is attention (*manasikāra*). Perception, volition, *phassa*, attention—these Dhamma factors are called mental factors (*nāma-dhamma*)—things which we in this world sometimes designate as "man", "animal", etc.</w:t>
-      </w:r>
-    </w:p>
-    <w:p>
-      <w:r>
-        <w:t>Now, wasn't there mention of gold coins? It is not about gold coins we are talking, but primarily about these mental factors (*nāma-dhamma*). Looking at it in this way, the child also must have realized: although we have put a "name" to these in the world and thought of them as "gold", what is here—the truth of what is present—is only this. There is some *vedanā*. Because of the expectation to obtain it, there is a pleasant feeling (*sukha-vedanā*). Accordingly, there is a notion that the category of "gold", the category of "gold coins", is something very valuable. There is a volition (*cetanā*)—an expectation—to obtain them. Because of this, when listening to the Dhamma phrase, there is some impingement, a contact (*phassa*). According to that contact, there is a making-in-the-mind (*manasikāra*)—the directing of the mind towards it. Through the mind, in this manner, all of these come together, and when the Buddha is preaching the Dhamma in this way, the child must have realized within himself: "This is what is happening in my *</w:t>
-      </w:r>
-      <w:r>
-        <w:t>Nibbāna</w:t>
-      </w:r>
-      <w:r>
-        <w:t xml:space="preserve"> [or inner calm]. There is no gold coin to be obtained. There is nothing valuable or extraordinary here. This is all that is here." That is the understanding of mental factors (*nāma-dhamma*).</w:t>
-      </w:r>
-    </w:p>
-    <w:p>
-      <w:r>
-        <w:t>Next, what are called physical factors (*rūpa-dhamma*) in the world</w:t>
-      </w:r>
-      <w:r>
-        <w:t xml:space="preserve">, </w:t>
-      </w:r>
-      <w:r>
-        <w:t>what are thoughts? All of these are based on, and made of, the four great elements known in the Dhamma as *pathavī*, *āpo*, *tejo*, *vāyo*. *Pathavī* means the hardness found in this great earth, the primary element found in trees, stones, etc. Likewise, *āpo* means—at this moment it is raining—this water element, which we recognize as the water element in great rivers and reservoirs. Likewise, *tejo* element is heat, *vāyo* element is wind. In this way, it is from this earth, water, heat, and wind that our body and other things are constructed. This is all that is here, even if we call them gold coins or gold; whether it is refined gold, silver, or raw gold, all of these contain only those four elements.</w:t>
-      </w:r>
-    </w:p>
-    <w:p>
-      <w:r>
-        <w:t>In this way, when reflecting on everything as a pile of names, a pile of perceptions, a pile of feelings—things received in the form of thoughts—one recognizes it as a pile of *phassa* (Contact), a contact, a reflecting by the mind. Next, for all other things in the world—whether valuable or worthless—there is no such distinction; it is through the realization that everything contains only these four elements that one is able to attain the deep stage of this Dhamma. That is called: reflecting on them as *nāmarūpa* factors. Perhaps for Kāla too, in that way, that warm expectation regarding the bag of gold coins disappeared, and he thought "this is a futile task"—"next, looking at it, what am I doing by this? I am so greedy for this Dhamma verse of the Buddha—thinking about this bag of gold coins." Then, gradually doing this, due to his very desire for the Dhamma verse, he developed a disillusionment with it. Ultimately, what specifically helps to obtain this supramundane state is—disillusionment with *saṁsāra*. Those noble ones who obtained this supreme state are spoken of in the Dhamma—like Paṭācārā, Kisāgotamī, etc.—when some tragic calamity occurred in their lives, they reflected, "this is the nature of the world".</w:t>
-      </w:r>
-    </w:p>
-    <w:p>
-      <w:r>
-        <w:t>When even that desire is abandoned, behold, the Dhamma—the Dhamma verse—begins to be grasped.</w:t>
-      </w:r>
-    </w:p>
-    <w:p>
-      <w:r>
-        <w:t>What is it? The more you try to grasp this Dhamma, the more it slips away, it slips away. He expects to grasp a Dhamma verse and go home to get those gold coins. But when he tries to "grasp" the Dhamma verse, the Dhamma slips away. Now, the more he lets go—the more he lets go of the desire for gold coins—behold, the Dhamma verse begins to be caught. From this, we can understand that what helps us to understand this entire Dhamma is letting go (relinquishment). Giving alms, keeping precepts, and all such meritorious deeds are done for letting go. The more one lets go, behold, the Dhamma is grasped. That is what ultimately, through such a great revolution of a conformed mind, contributed to Kāla obtaining that kind of supramundane state—the state of Stream-entry. It is possible even for someone who practiced meditation in a previous *saṁsāric* life, even if they lived that way in the early part of this life due to some misfortune, to obtain this noble fruit of Stream-entry through the wonderful path of the Buddha's Dhamma.</w:t>
-      </w:r>
-    </w:p>
-    <w:p>
-      <w:r>
-        <w:t>Now, from this story, there are very valuable facts for us to understand. First of all, when we think about the stratagem used by the treasurer Anāthapiṇḍika, we understand that parents of this day should give a good heritage to their children; in that way, on a Poya day, he used a certain stratagem to bring his young child close to the Triple Gem. Most importantly, the inheritance to be given to one's children is the heritage of faith and the heritage of Dhamma. In that way, the treasurer Anāthapiṇḍika, by putting money at stake—giving a promise of money—tried to bring the child close to the Triple Gem, and succeeded thereafter.</w:t>
-      </w:r>
-    </w:p>
-    <w:p>
-      <w:r>
-        <w:t>Similarly, there is an example here that we can take into our lives. What is it? Now, the life problem presented to us—the problem that was in front of Kāla's life—was to grasp a Dhamma verse somehow, go back, and get the gold coins. Out of that very problem, the child unearths *</w:t>
-      </w:r>
-      <w:r>
-        <w:t>Nibbāna</w:t>
-      </w:r>
-      <w:r>
-        <w:t>. For that to happen, some transformation had to take place in his mind, and in that way....the world does not know how to obtain that other warm craving (*taṇhā*) from that existence (*bhava*). For that purpose, what happens is that one looks at the world in a certain special way. The Buddha has shown that way of looking. In the way ordinary worldly people look at the world, there are certain misunderstandings—they recognize them in the world as mental names of incorrect characteristics. Likewise, there is "dukkha-sukha-saññā"—a perception of pleasure in what is painful/stressful, which worldly people have; a mind that takes what is not beautiful as beautiful, or as good; if there is a clean perception regarding what is unclean, those appear as good. Similarly, where there is no self (*attā*), they take it as a "self"—as "I" or "mine". In this way, the fourfold misunderstandings that exist in the world have been declared; they are called "*vipallāsa-dhamma*" (perversions of view). Distorted ideas mean completely wrong ideas, just like turning things upside down. Then, how should Buddhists strive? One must practice reflecting on impermanent things as impermanent (*anicca*). One must practice reflecting on painful things as pain (*dukkha*). One must practice reflecting on unlovely things as unlovely. One must practice training the mind to see non-self things—things that cannot be taken as "I" or "mine"—exactly as they are, as not mine.</w:t>
-      </w:r>
-    </w:p>
-    <w:p>
-      <w:r>
-        <w:t>Now, that is exactly what happened within that child. Before listening to the Dhamma, he thought, "this is what is there, the desired thing". Thinking in this way, with a great desire and aspiration for the bag of gold coins, he began to listen to the Dhamma. But later, due to the Buddha's skillful strategy, the understanding comes from there. There is nothing to be taken here. This is impermanent, painful. There is a change in the way he looks at the world.</w:t>
-      </w:r>
-    </w:p>
-    <w:p>
-      <w:r>
-        <w:t xml:space="preserve">Next, there is only one more thing—if we are to unearth the Dhamma from within our life problems—which is called reflection (contemplation). This..contemplating on everything, directing the mind, and trying to gain an understanding is reflection. Through this reflection, whether in a wrong way or a right way—one of these two—attention (*manasikāra*) is changed. Therein, what is called *ayoniso manasikāra* (unwise attention) and </w:t>
-      </w:r>
-      <w:r>
-        <w:t>*Yoniso manasikāra* (Wise attention)</w:t>
-      </w:r>
-      <w:r>
-        <w:t>—if we translate them into simple, understandable Sinhala: *ayoniso manasikāra* is "inappropriate" or "improper"—reflecting in an improper manner. An illustration of this is: even though this child listened to the Buddha's Dhamma—in the early stage of this event—he began to reflect on the Dhamma verse while keeping the bag of gold coins in mind.</w:t>
-      </w:r>
-    </w:p>
-    <w:p>
-      <w:r>
-        <w:t xml:space="preserve">In that way—since behind it was the very desire for the bag of gold coins—with that kind of reflection, the Dhamma verse is not properly caught. That is wrong reflection. Most people in the world, when they reflect on various things, reflect in a wrong way. But reflecting in the correct way is what is called </w:t>
-      </w:r>
-      <w:r>
-        <w:t>*Yoniso manasikāra* (Wise attention)</w:t>
-      </w:r>
-      <w:r>
-        <w:t>. Instead of thinking there are living beings where there are none, here there is—a pile of feelings (*vedanā*), consciousness (*viññāṇa*), preparations (*saṅkhāra*), a pile of reflections—reflecting in this way that there are only these four elements, namely *pathavī*, *āpo*, *tejo*, *vāyo*. In this way, reflecting on their true nature is what the other person does. That is what needs to be developed. Training the mind in this manner helps to realize *Nibbāna*; one must abandon wrong reflection and practice reflecting in the correct manner.</w:t>
-      </w:r>
-    </w:p>
-    <w:p>
-      <w:r>
-        <w:t>Likewise, there is another thing—something connected to this very reflection—when thinking about various things, one tries to grasp them tightly—that is called *parāmāsa* (misapprehension / clinging). During the Buddha's time, there were some people who clung to external religious shrines/practices, thinking that through *sīla* (precepts)—by keeping precepts in that way—they could attain *Nibbāna* or escape from *saṁsāra*. The way they cling to various views—incorrectly—has been shown. It is like "handling" or "touching fire". What we understand from this—let us go to the simile of the banana trunk of the person who saw a banana tree for the first time...brought it, and went on clinging to it. He went on clinging to it thinking "there is heartwood in this". This kind of clinging, grasping is called *parāmāsa*. How do we understand that one can never attain *Nibbāna* by doing so? It is when, after peeling off one sheath of that banana trunk, one feels it subtly, that the presence of the next sheath is caught; and as one grasps sheath by sheath, one realizes that this is a pile of sheaths. Grasping one sheath, next he feels it subtly. When that sheath ends, another sheath, under that another sheath, in this way he feels it subtly. This is contemplation, not misapprehension; indeed, this is what performs *yoniso manasikāra*. From the very beginning, the first understanding of all these things comes according to the names given to them by the world, according to the value given to them: "a very valuable thing, something that should be in every house"—in a way of grasping them. But when reflecting slowly, the understanding comes that "here there is only a temporary thing, a low/crude thing". Ultimately, the realization comes that it is only something that belongs to others, only something to be clung to. When slowly feeling that banana trunk, going sheath by sheath, ultimately he understands that there is no heartwood. Here there is only a pile of thoughts. A pile of thoughts, nothing to take as "I" or "mine". A multitude of thoughts arise and exist.</w:t>
-      </w:r>
-    </w:p>
-    <w:p>
-      <w:r>
-        <w:t>It is when one thinks and reflects in that way that the Dhamma is deeply understood. The Buddha has declared the Four Noble Truths—the entire *saṁsāric* existence, this five-fold group of clinging (*pañcupādānakkhandha* / five aggregates) namely form, feeling, perception, preparations (*saṅkhāra*), and consciousness (*viññāṇa*), is the Truth of Suffering (*dukkha-sacca*). The truth of suffering in the world. This suffering arises because of the craving (*taṇhā*) that worldly people have towards it. It is because of the craving for that bag of gold coins that such suffering arose for that child when he went to listen to the Dhamma verse. Thus, the understanding of that suffering arose. Underneath that suffering is craving (*taṇhā*). The state when this craving is eradicated, when it is stilled, is called *Nibbāna*. For that child, when the craving for the bag of gold coins</w:t>
-      </w:r>
-      <w:r>
-        <w:t xml:space="preserve"> </w:t>
-      </w:r>
-      <w:r>
-        <w:t>was abandoned, and next when the Dhamma began to be understood, behold, *Nibbāna* was realized. The path that helps towards this is what is called the Noble Eightfold Path (*ariya aṭṭhaṅgika magga*). *Sammā-diṭṭhi*, *sammā-saṅkappa*, *sammā-vācā*, *sammā-kammanta*, *sammā-ājīva*, *sammā-vāyāma*, *sammā-sati*, *sammā-samādhi*—namely, Right View, Right Thought/Intention aligned with Right View, Right Speech aligned with Right Thought, Right Action/Livelihood aligned with Right Speech, Right Effort—striving—to purify the mind, Right Mindfulness—*sati*—arising therein, and the concentration (*samādhi*) arising in association with that mindfulness. This Noble Eightfold Path is the Fourth Truth. It is through the realization of these Four Noble Truths that anyone, whether great or small, whether a seven-year-old child or a servant, obtains the paths and fruits (*magga-phala*). It is by understanding such deep Dhamma—this is not something merely expressed in words, but a Dhamma to be understood from within—and if one correctly understands the benefits that can be taken for life, one is able to incorporate various virtues—various meritorious Dhamma factors born of meditation—into one's mind stream in one's daily life, through one's very life problems. Therefore, this is the example to be taken from this Dhamma story about the young child named 'Kāla'.</w:t>
-      </w:r>
-    </w:p>
-    <w:p>
-      <w:r>
-        <w:t xml:space="preserve">If there is something black/dark in a person in this world, behold, they can make it white. In this Dhamma, by abandoning that wrong understanding, by abandoning wrong reflections called *ayoniso manasikāra* (unwise attention), and turning towards correct understanding—if one trains in correct reflections called </w:t>
-      </w:r>
-      <w:r>
-        <w:t>*Yoniso manasikāra* (Wise attention)</w:t>
-      </w:r>
-      <w:r>
-        <w:t>—by abandoning that attitude of looking at the world in a wrong way and training to look at the world in the correct way, then that person is able, perhaps even in the midst of their work in this life, to make their mind concentrated and obtain those paths and fruits through those very activities. It is mentioned in various places during the Buddha's time that some Elders and bhikkhunīs, seeing a lamp being extinguished—having gone to extinguish a lamp, seeing the flame going out, and gaining some understanding—some seeing a forest fire, some seeing foam floating on water, seeing various such things, they realized *Nibbāna* from within, in that manner. Through every single one of those, they developed a deep understanding of the world. By using one illustration in the world, in that very manner, when the ability to understand all other things with wisdom arises, then that person is able to realize those supramundane paths and fruits. In this time, just as in the Buddha's time, or perhaps even more, various kinds of suffering, calamities, and disasters are heard of in this world and society. Among them, those who are suitable unearth *Nibbāna*.</w:t>
-      </w:r>
-    </w:p>
-    <w:p>
-      <w:r>
-        <w:t xml:space="preserve">Similarly, now, that bag of gold coins for which Kāla was praised—just like that bag of gold coins, in this time too, one hears everywhere about the "jackpot", the "fortune bag". There may be thousands, lakhs of people buying tickets expecting this jackpot or fortune bag. Not all of them win this jackpot or fortune bag. It does not matter if they do not get them. Through them, just as that child named Kāla did—one should try to draw close to the Dhamma. What is said here? Whether this jackpot or fortune bag is received or not, this is the nature of this life. All of these are </w:t>
-      </w:r>
-      <w:r>
-        <w:t>*Anicca* (Impermanent)</w:t>
-      </w:r>
-      <w:r>
-        <w:t>. Every effort made in pursuit of impermanent things is painful. If the truth of the world is thought of in this way, there is nothing here to be taken as "I" or "mine". There is no essence, no core. At the moment of death, all of this has to be abandoned. All those accumulations of wealth, relatives, and friends taken as "I" and "mine" have to be left behind. Ultimately, that person thinks "*anicca vata saṅkhārā*" (impermanent indeed are preparations) or "*sabbe saṅkhārā aniccā*" (all preparations are impermanent), united in meditation. By the time they see those, that person has already died. There is no time to make an effort for that supramundane `[...unclear...]`. Thus—the entire life—we said is a series of fashions, a series of preparations. It is just like sometimes dreaming of preparing to go on a journey.</w:t>
-      </w:r>
-      <w:r>
-        <w:t xml:space="preserve"> T</w:t>
-      </w:r>
-      <w:r>
-        <w:t>here is some lack, running back again to complete `[...unclear...]`. Doing so, those who journey through the world do not receive `[...unclear...]`. That is the kind of thing done in the entire life. From a young child to an old person seeing, the entire life is a pile of those fashions and preparations. But the pain or pleasure therein is not felt. It is just like that banana trunk, there is only a running, only a fatigue, only a thirst—such an understanding arises in a person.</w:t>
-      </w:r>
-    </w:p>
-    <w:p>
-      <w:r>
-        <w:t>It is when that understanding arises that, in the manner declared by the Buddha, to obtain the fruit of Stream-entry which is more noble than sovereignty over the earth, more noble than going to heaven, more noble than lordship over the whole world `[...unclear...]`. If one has obtained that fruit, one will be reborn at most seven more times. Then, if one further develops that Noble Eightfold Path, and meditates even deeper, that person is able to obtain the second path and fruit called Once-returning (*Sakadāgāmī*), leaving only one more return to this world, and escaping from the rest of the suffering of *saṁsāra*. If one develops that Noble Eightfold Path even further, that person `[...unclear...]` arrives at the fruit of Non-returning (*Anāgāmī*), and without returning to this world, directly realizes supramundane *</w:t>
-      </w:r>
-      <w:r>
-        <w:t>Nibbāna</w:t>
-      </w:r>
-      <w:r>
-        <w:t>. Striving even beyond that, meditating deeply, one is somehow able to completely destroy these defilements and find peace in the noble, great, deathless *Nibbāna*, escaping from the entire suffering of *saṁsāra* such as birth (*jāti* [Birth / Arising]), decay (*jarā*), disease, and death (*maraṇa* [Decay and Death / Aging and Death]).</w:t>
-      </w:r>
-    </w:p>
-    <w:p>
-      <w:r>
-        <w:t>Thus, through the story of this banker's son Kāla, we were able to establish our minds on the path to *Nibbāna*. If we go very deep into even a single Dhamma verse preached by the Buddha, *Nibbāna* is present there—we can say this `[...unclear...]`. If we take a single drop from this ocean of the Buddha's Dhamma, every single one of them tastes of liberation, tastes of *Nibbāna*. Just as water taken from anywhere in the great ocean tastes of salt,</w:t>
-      </w:r>
-      <w:r>
-        <w:t xml:space="preserve"> </w:t>
-      </w:r>
-      <w:r>
-        <w:t>if we take even one cool drop from that ocean of Dhamma, we can direct our mind through that drop all the way to *Nibbāna*. Even when listening to the Dhamma, having abandoned the temporary objects of *saṁsāra*, one can realize *Nibbāna*. The Buddha has declared that the realization of the paths and fruits can be obtained not only on the meditation seat, but in five places; they are called "*vimuttāyatana*" (stages of liberation). Liberation means freedom—freedom from *saṁsāra*. *Āyatana* means a center or a place where one can obtain that freedom. Five such places have been shown.</w:t>
-      </w:r>
-    </w:p>
-    <w:p>
-      <w:r>
-        <w:t>What are those five places? First, when listening to the Dhamma. When listening to the Dhamma, by directing the mind well to it, with the help of reflecting deeply, one can obtain that supramundane fruit. Second, when preaching the Dhamma. Even when preaching the Dhamma, during the time the mind is maintained in the Dhamma—just as `[...unclear...]` on some occasion, experiencing some spiritual urgency, it is shown that one can obtain understanding. Thirdly, when reflecting on the Dhamma—having realized it, when reflecting on a certain factor of the Dhamma, suddenly a correct understanding—an inner understanding—comes, and one can realize *Nibbāna* by realizing the paths and fruits in that manner. Fourthly, when reciting the Dhamma—when reciting the Dhamma, by applying the mind well, then too, the mind becomes one-pointed and concentrated, and through that, an inner understanding comes, and one can obtain those fruits such as Stream-entry. One can also become an Arahant. Lastly, what is shown fifth is some sign of concentration (*samādhi-nimitta*)—that is what is generally regarded as meditation in the world—systematically developing meditation based on some sign of concentration. In this way, if one engages in activities such as listening to the Dhamma, preaching the Dhamma, and reflecting on the Dhamma in daily life, one can realize those paths and fruits. Accordingly, we must strive to take the benefits that can be gained from this Dhamma in our daily lives, in our own lives, based on this discourse.</w:t>
-      </w:r>
-    </w:p>
-    <w:p>
-      <w:r>
-        <w:t>Today, then, this Sinhala group, through this listening to the Dhamma `[...unclear...]` ultimately performed a great mass of merit. Listening to the Dhamma</w:t>
-      </w:r>
-      <w:r>
-        <w:t xml:space="preserve"> </w:t>
-      </w:r>
-      <w:r>
-        <w:t>is not just a general custom; if one listens to the Dhamma applying one's mind to life, that becomes a strong supportive condition for life. Having obtained this human state of existence, if we have a desire, an effort towards the Dhamma, we practice it continuously for a long time. Then, this listening to the Dhamma helps even for *saṁsāra*. On those occasions, if someone strives, they can obtain the noble realization of the paths and fruits through a single Dhamma verse, just like the child Kāla. Therefore, on this occasion, you have observed the precepts and listened to the Dhamma. You have generated a great mass of meritorious intentions. You have performed a great mass of merit—may this merit of listening to the Dhamma, this merit, this supportive condition of merit, enable us to realize the paths and fruits such as Stream-entry in this very life, and ultimately realize the supreme, noble, great deathless peace of *Nibbāna*.</w:t>
-      </w:r>
-    </w:p>
-    <w:p>
-      <w:r>
-        <w:t>Likewise, may we share this accumulated mass of merit with all deities who protect the world, including any class of divine beings who are guardians of this place, so that they may rejoice and find peace in the supreme, noble, great deathless *Nibbāna* characterized by diligence. In the same way, if there are any departed relatives, friends, etc., who have gone to the other world, may this noble merit be shared with all living beings in this world system who expect it, so that they may escape from all *saṁsāric* suffering such as birth, decay, disease, and death, and find peace in the supreme, noble, great deathless *Nibbāna* characterized by diligence. Having aspired thus, at this moment, share this merit with all beings in this manner.</w:t>
-      </w:r>
-    </w:p>
-    <w:p>
-      <w:r>
-        <w:t>*"Esā'va maggo... amataṁ"*</w:t>
-      </w:r>
+        <w:t>*</w:t>
+      </w:r>
+      <w:proofErr w:type="spellStart"/>
+      <w:r>
+        <w:t>Etthāvatā</w:t>
+      </w:r>
+      <w:proofErr w:type="spellEnd"/>
+      <w:r>
+        <w:t xml:space="preserve"> ca.</w:t>
+      </w:r>
+      <w:proofErr w:type="gramStart"/>
+      <w:r>
+        <w:t>..*</w:t>
+      </w:r>
+      <w:proofErr w:type="gramEnd"/>
     </w:p>
     <w:sectPr>
       <w:pgSz w:w="12240" w:h="15840"/>

</xml_diff>